<commit_message>
Updated the integrated M3E canvas window, debugger orchestrator, memory governor, and documentation suite
</commit_message>
<xml_diff>
--- a/website/public/campaign/ENTERPRISE-WHITEPAPER.docx
+++ b/website/public/campaign/ENTERPRISE-WHITEPAPER.docx
@@ -230,15 +230,15 @@
       <w:r>
         <w:t xml:space="preserve">Modern software engineering organizations face an acute trilemma when evaluating first-generation generative AI developer tools:</w:t>
       </w:r>
-      <w:r>
-        <w:t xml:space="preserve"> </w:t>
-      </w:r>
-      <w:r>
-        <w:t xml:space="preserve">1.</w:t>
-      </w:r>
-      <w:r>
-        <w:t xml:space="preserve"> </w:t>
-      </w:r>
+    </w:p>
+    <w:p>
+      <w:pPr>
+        <w:pStyle w:val="Compact"/>
+        <w:numPr>
+          <w:ilvl w:val="0"/>
+          <w:numId w:val="1001"/>
+        </w:numPr>
+      </w:pPr>
       <w:r>
         <w:rPr>
           <w:b/>
@@ -252,15 +252,15 @@
       <w:r>
         <w:t xml:space="preserve">Cloud-hosted AI coding assistants (e.g., GitHub Copilot, Cursor, Windsurf) mandate streaming proprietary abstract syntax trees (ASTs), source text, internal endpoints, and confidential intellectual property over public transit to third-party multitenant SaaS clusters. This introduces severe regulatory and compliance non-conformance under SOC2 Type II, ISO/IEC 27001, HIPAA, GDPR Art. 28, and NIST SP 800-53 r5 controls.</w:t>
       </w:r>
-      <w:r>
-        <w:t xml:space="preserve"> </w:t>
-      </w:r>
-      <w:r>
-        <w:t xml:space="preserve">2.</w:t>
-      </w:r>
-      <w:r>
-        <w:t xml:space="preserve"> </w:t>
-      </w:r>
+    </w:p>
+    <w:p>
+      <w:pPr>
+        <w:pStyle w:val="Compact"/>
+        <w:numPr>
+          <w:ilvl w:val="0"/>
+          <w:numId w:val="1001"/>
+        </w:numPr>
+      </w:pPr>
       <w:r>
         <w:rPr>
           <w:b/>
@@ -274,15 +274,15 @@
       <w:r>
         <w:t xml:space="preserve">Cloud-bound token economics scale superlinearly with developer headcount and repository complexity. High-throughput development environments generate recurrent six-figure model invocation invoices alongside unpredictable rate-limiting throttling events.</w:t>
       </w:r>
-      <w:r>
-        <w:t xml:space="preserve"> </w:t>
-      </w:r>
-      <w:r>
-        <w:t xml:space="preserve">3.</w:t>
-      </w:r>
-      <w:r>
-        <w:t xml:space="preserve"> </w:t>
-      </w:r>
+    </w:p>
+    <w:p>
+      <w:pPr>
+        <w:pStyle w:val="Compact"/>
+        <w:numPr>
+          <w:ilvl w:val="0"/>
+          <w:numId w:val="1001"/>
+        </w:numPr>
+      </w:pPr>
       <w:r>
         <w:rPr>
           <w:b/>
@@ -312,7 +312,7 @@
         <w:pStyle w:val="FirstParagraph"/>
       </w:pPr>
       <w:r>
-        <w:t xml:space="preserve">Ty-Code is engineered from first principles as an air-gap capable, local-first autonomous development environment. All semantic indexing, dynamic profiling, workspace mutation analysis, and credential containment execute strictly on the host operating system. Network egress is restricted exclusively to authenticated, policy-governed inference endpoints—whether self-hosted on-premises large language model (LLM) clusters (vLLM, Ollama, TensorRT-LLM), enterprise cloud VPC gateways (AWS Bedrock PrivateLink, Azure OpenAI Dedicated Gateways), or curated high-throughput providers.</w:t>
+        <w:t xml:space="preserve">Ty-Code is engineered from first principles as an air-gap capable, local-first autonomous development environment. All semantic indexing, dynamic profiling, workspace mutation analysis, and credential containment execute strictly on the host operating system. Network egress is restricted exclusively to authenticated, policy-governed inference endpoints, whether self-hosted on-premises large language model (LLM) clusters (vLLM, Ollama, TensorRT-LLM), enterprise cloud VPC gateways (AWS Bedrock PrivateLink, Azure OpenAI Dedicated Gateways), or curated high-throughput providers.</w:t>
       </w:r>
     </w:p>
     <w:p>
@@ -334,7 +334,7 @@
       <w:pPr>
         <w:pStyle w:val="Heading2"/>
       </w:pPr>
-      <w:bookmarkStart w:id="13" w:name="_e51a0a7ca8efc18783817b6fe80884efbafbf6a"/>
+      <w:bookmarkStart w:id="13" w:name="_c897181f214e38aa026ea84b16f3d49023f884b"/>
       <w:r>
         <w:t xml:space="preserve">1. Threat Model &amp; Security Architecture</w:t>
       </w:r>
@@ -579,7 +579,7 @@
       <w:pPr>
         <w:pStyle w:val="Heading3"/>
       </w:pPr>
-      <w:bookmarkStart w:id="14" w:name="_2a3e5d7551399d169dd309488a641ae1513a562"/>
+      <w:bookmarkStart w:id="14" w:name="_d4b2948d3737072fbe26644a8beb2d584a215b7"/>
       <w:r>
         <w:t xml:space="preserve">1.1 The Zero-Telemetry Guarantee &amp; Perimeter Containment</w:t>
       </w:r>
@@ -610,7 +610,7 @@
       <w:pPr>
         <w:pStyle w:val="Heading3"/>
       </w:pPr>
-      <w:bookmarkStart w:id="15" w:name="_fba79ffdabb27c45ae16cae968a8ee1e4204465"/>
+      <w:bookmarkStart w:id="15" w:name="_31b4c65edf7507054d8e66f480f7086b1fe73ab"/>
       <w:r>
         <w:t xml:space="preserve">1.2 Process Isolation, contextBridge, and Strict IPC Validation</w:t>
       </w:r>
@@ -623,15 +623,15 @@
       <w:r>
         <w:t xml:space="preserve">Ty-Code enforces absolute Chromium sandbox isolation between the untrusted web presentation layer and the privileged Node.js desktop core:</w:t>
       </w:r>
-      <w:r>
-        <w:t xml:space="preserve"> </w:t>
-      </w:r>
-      <w:r>
-        <w:t xml:space="preserve">-</w:t>
-      </w:r>
-      <w:r>
-        <w:t xml:space="preserve"> </w:t>
-      </w:r>
+    </w:p>
+    <w:p>
+      <w:pPr>
+        <w:pStyle w:val="Compact"/>
+        <w:numPr>
+          <w:ilvl w:val="0"/>
+          <w:numId w:val="1002"/>
+        </w:numPr>
+      </w:pPr>
       <w:r>
         <w:rPr>
           <w:rStyle w:val="VerbatimChar"/>
@@ -641,15 +641,15 @@
       <w:r>
         <w:t xml:space="preserve">: Renderer processes are physically barred from loading native Node.js binaries, accessing the POSIX/Win32 file system, or binding raw sockets.</w:t>
       </w:r>
-      <w:r>
-        <w:t xml:space="preserve"> </w:t>
-      </w:r>
-      <w:r>
-        <w:t xml:space="preserve">-</w:t>
-      </w:r>
-      <w:r>
-        <w:t xml:space="preserve"> </w:t>
-      </w:r>
+    </w:p>
+    <w:p>
+      <w:pPr>
+        <w:pStyle w:val="Compact"/>
+        <w:numPr>
+          <w:ilvl w:val="0"/>
+          <w:numId w:val="1002"/>
+        </w:numPr>
+      </w:pPr>
       <w:r>
         <w:rPr>
           <w:rStyle w:val="VerbatimChar"/>
@@ -659,15 +659,15 @@
       <w:r>
         <w:t xml:space="preserve">: Preload execution contexts exist in a segregated V8 world. Prototype pollution within the renderer cannot mutate preload primitives or hijack execution flow.</w:t>
       </w:r>
-      <w:r>
-        <w:t xml:space="preserve"> </w:t>
-      </w:r>
-      <w:r>
-        <w:t xml:space="preserve">-</w:t>
-      </w:r>
-      <w:r>
-        <w:t xml:space="preserve"> </w:t>
-      </w:r>
+    </w:p>
+    <w:p>
+      <w:pPr>
+        <w:pStyle w:val="Compact"/>
+        <w:numPr>
+          <w:ilvl w:val="0"/>
+          <w:numId w:val="1002"/>
+        </w:numPr>
+      </w:pPr>
       <w:r>
         <w:rPr>
           <w:rStyle w:val="VerbatimChar"/>
@@ -704,15 +704,15 @@
       <w:r>
         <w:t xml:space="preserve">.</w:t>
       </w:r>
-      <w:r>
-        <w:t xml:space="preserve"> </w:t>
-      </w:r>
-      <w:r>
-        <w:t xml:space="preserve">-</w:t>
-      </w:r>
-      <w:r>
-        <w:t xml:space="preserve"> </w:t>
-      </w:r>
+    </w:p>
+    <w:p>
+      <w:pPr>
+        <w:pStyle w:val="Compact"/>
+        <w:numPr>
+          <w:ilvl w:val="0"/>
+          <w:numId w:val="1002"/>
+        </w:numPr>
+      </w:pPr>
       <w:r>
         <w:rPr>
           <w:b/>
@@ -1258,7 +1258,7 @@
       <w:pPr>
         <w:pStyle w:val="Heading3"/>
       </w:pPr>
-      <w:bookmarkStart w:id="16" w:name="_d15c4206032fffecb82397c3bf3669e53706159"/>
+      <w:bookmarkStart w:id="16" w:name="_403752b05ea428b7f878c9cf8d4be1acd77731d"/>
       <w:r>
         <w:t xml:space="preserve">1.2 Hardware-Backed Credential Security (</w:t>
       </w:r>
@@ -1295,15 +1295,15 @@
       <w:r>
         <w:t xml:space="preserve">secret retention in favor of operating-system-level cryptographic keyrings:</w:t>
       </w:r>
-      <w:r>
-        <w:t xml:space="preserve"> </w:t>
-      </w:r>
-      <w:r>
-        <w:t xml:space="preserve">-</w:t>
-      </w:r>
-      <w:r>
-        <w:t xml:space="preserve"> </w:t>
-      </w:r>
+    </w:p>
+    <w:p>
+      <w:pPr>
+        <w:pStyle w:val="Compact"/>
+        <w:numPr>
+          <w:ilvl w:val="0"/>
+          <w:numId w:val="1003"/>
+        </w:numPr>
+      </w:pPr>
       <w:r>
         <w:rPr>
           <w:b/>
@@ -1327,17 +1327,17 @@
         <w:t xml:space="preserve"> </w:t>
       </w:r>
       <w:r>
-        <w:t xml:space="preserve">/ DPAPI). Encryption keys are derived dynamically from the logged-in user’s NT security principal and master key hierarchy, sealed by the Windows Local Security Authority Subsystem Service (LSASS).</w:t>
-      </w:r>
-      <w:r>
-        <w:t xml:space="preserve"> </w:t>
-      </w:r>
-      <w:r>
-        <w:t xml:space="preserve">-</w:t>
-      </w:r>
-      <w:r>
-        <w:t xml:space="preserve"> </w:t>
-      </w:r>
+        <w:t xml:space="preserve">/ DPAPI). Encryption keys are derived dynamically from the logged-in user's NT security principal and master key hierarchy, sealed by the Windows Local Security Authority Subsystem Service (LSASS).</w:t>
+      </w:r>
+    </w:p>
+    <w:p>
+      <w:pPr>
+        <w:pStyle w:val="Compact"/>
+        <w:numPr>
+          <w:ilvl w:val="0"/>
+          <w:numId w:val="1003"/>
+        </w:numPr>
+      </w:pPr>
       <w:r>
         <w:rPr>
           <w:b/>
@@ -1351,15 +1351,15 @@
       <w:r>
         <w:t xml:space="preserve">Stored within the Apple Keychain Services architecture using 256-bit AES-GCM keys managed by the OS security subsystem and hardware Secure Enclave.</w:t>
       </w:r>
-      <w:r>
-        <w:t xml:space="preserve"> </w:t>
-      </w:r>
-      <w:r>
-        <w:t xml:space="preserve">-</w:t>
-      </w:r>
-      <w:r>
-        <w:t xml:space="preserve"> </w:t>
-      </w:r>
+    </w:p>
+    <w:p>
+      <w:pPr>
+        <w:pStyle w:val="Compact"/>
+        <w:numPr>
+          <w:ilvl w:val="0"/>
+          <w:numId w:val="1003"/>
+        </w:numPr>
+      </w:pPr>
       <w:r>
         <w:rPr>
           <w:b/>
@@ -2656,7 +2656,7 @@
       <w:pPr>
         <w:pStyle w:val="Heading3"/>
       </w:pPr>
-      <w:bookmarkStart w:id="18" w:name="_8d7368c576332e270f36e307505dfec43ba6037"/>
+      <w:bookmarkStart w:id="18" w:name="_3684891f427c05bbbd33493f7fe52b2ede7b5ae"/>
       <w:r>
         <w:t xml:space="preserve">1.3 The Three-Tier Terminal Sandbox &amp; Workspace Containment</w:t>
       </w:r>
@@ -2673,8 +2673,7 @@
     <w:tbl>
       <w:tblPr>
         <w:tblStyle w:val="Table"/>
-        <w:tblW w:type="pct" w:w="5000"/>
-        <w:tblLayout w:type="fixed"/>
+        <w:tblW w:type="auto" w:w="0"/>
         <w:tblLook w:firstRow="1" w:lastRow="0" w:firstColumn="0" w:lastColumn="0" w:noHBand="0" w:noVBand="0" w:val="0020"/>
       </w:tblPr>
       <w:tblGrid>
@@ -3006,7 +3005,7 @@
         <w:pStyle w:val="Compact"/>
         <w:numPr>
           <w:ilvl w:val="0"/>
-          <w:numId w:val="1001"/>
+          <w:numId w:val="1004"/>
         </w:numPr>
       </w:pPr>
       <w:r>
@@ -3109,7 +3108,7 @@
         <w:pStyle w:val="Compact"/>
         <w:numPr>
           <w:ilvl w:val="0"/>
-          <w:numId w:val="1001"/>
+          <w:numId w:val="1004"/>
         </w:numPr>
       </w:pPr>
       <w:r>
@@ -3227,7 +3226,7 @@
         <w:pStyle w:val="Compact"/>
         <w:numPr>
           <w:ilvl w:val="0"/>
-          <w:numId w:val="1001"/>
+          <w:numId w:val="1004"/>
         </w:numPr>
       </w:pPr>
       <w:r>
@@ -3264,7 +3263,7 @@
       <w:pPr>
         <w:pStyle w:val="Heading2"/>
       </w:pPr>
-      <w:bookmarkStart w:id="20" w:name="_79992f67f259a2ee32f60f9a5d75e920e65edf2"/>
+      <w:bookmarkStart w:id="20" w:name="_a9e04a36ed1ec0865414f9c0a4dc92a7ea7f05c"/>
       <w:r>
         <w:t xml:space="preserve">2. The Omni-Orchestrator &amp; ProviderGateway</w:t>
       </w:r>
@@ -3274,7 +3273,7 @@
       <w:pPr>
         <w:pStyle w:val="Heading3"/>
       </w:pPr>
-      <w:bookmarkStart w:id="21" w:name="_ce541a7115797f2aa58e0665988bc37e65465d3"/>
+      <w:bookmarkStart w:id="21" w:name="_8e0932a32181af07235a014a51363d2bc57f110"/>
       <w:r>
         <w:t xml:space="preserve">2.1 The Adapter Pattern: Normalizing SSE, NDJSON, and Typed Streams</w:t>
       </w:r>
@@ -5028,7 +5027,7 @@
       <w:pPr>
         <w:pStyle w:val="Heading3"/>
       </w:pPr>
-      <w:bookmarkStart w:id="23" w:name="_6f55be55da021bae03be9715615da088829c631"/>
+      <w:bookmarkStart w:id="23" w:name="_45147e94629097bac2d37cfc3ae20cc36e894b7"/>
       <w:r>
         <w:t xml:space="preserve">2.2 Dynamic Health-Aware Failover Chain</w:t>
       </w:r>
@@ -5041,15 +5040,15 @@
       <w:r>
         <w:t xml:space="preserve">Enterprise environments cannot tolerate pipeline disruption due to transient cloud 5xx errors or local model crashes. The Omni-Orchestrator maintains a dynamic Directed Acyclic Graph (DAG) of provider candidates:</w:t>
       </w:r>
-      <w:r>
-        <w:t xml:space="preserve"> </w:t>
-      </w:r>
-      <w:r>
-        <w:t xml:space="preserve">1.</w:t>
-      </w:r>
-      <w:r>
-        <w:t xml:space="preserve"> </w:t>
-      </w:r>
+    </w:p>
+    <w:p>
+      <w:pPr>
+        <w:pStyle w:val="Compact"/>
+        <w:numPr>
+          <w:ilvl w:val="0"/>
+          <w:numId w:val="1005"/>
+        </w:numPr>
+      </w:pPr>
       <w:r>
         <w:rPr>
           <w:b/>
@@ -5179,15 +5178,15 @@
       <w:r>
         <w:t xml:space="preserve">.</w:t>
       </w:r>
-      <w:r>
-        <w:t xml:space="preserve"> </w:t>
-      </w:r>
-      <w:r>
-        <w:t xml:space="preserve">2.</w:t>
-      </w:r>
-      <w:r>
-        <w:t xml:space="preserve"> </w:t>
-      </w:r>
+    </w:p>
+    <w:p>
+      <w:pPr>
+        <w:pStyle w:val="Compact"/>
+        <w:numPr>
+          <w:ilvl w:val="0"/>
+          <w:numId w:val="1005"/>
+        </w:numPr>
+      </w:pPr>
       <w:r>
         <w:rPr>
           <w:b/>
@@ -5201,15 +5200,15 @@
       <w:r>
         <w:t xml:space="preserve">If a model disconnects mid-stream, the orchestrator preserves the partial response, appends an internal handoff milestone checkpoint, and dispatches the continuation prompt to the next qualified model in the hierarchy.</w:t>
       </w:r>
-      <w:r>
-        <w:t xml:space="preserve"> </w:t>
-      </w:r>
-      <w:r>
-        <w:t xml:space="preserve">3.</w:t>
-      </w:r>
-      <w:r>
-        <w:t xml:space="preserve"> </w:t>
-      </w:r>
+    </w:p>
+    <w:p>
+      <w:pPr>
+        <w:pStyle w:val="Compact"/>
+        <w:numPr>
+          <w:ilvl w:val="0"/>
+          <w:numId w:val="1005"/>
+        </w:numPr>
+      </w:pPr>
       <w:r>
         <w:rPr>
           <w:b/>
@@ -5281,7 +5280,7 @@
       <w:pPr>
         <w:pStyle w:val="Heading2"/>
       </w:pPr>
-      <w:bookmarkStart w:id="24" w:name="_8fa63936dbc8fa9b45c86aa9f25f94229a5e669"/>
+      <w:bookmarkStart w:id="24" w:name="_541156604bd999ec4a63e6dfba141028c438b49"/>
       <w:r>
         <w:t xml:space="preserve">3. Agentic Execution &amp; Context Engineering</w:t>
       </w:r>
@@ -5291,7 +5290,7 @@
       <w:pPr>
         <w:pStyle w:val="Heading3"/>
       </w:pPr>
-      <w:bookmarkStart w:id="25" w:name="_ea59996a50d002b47d87e0b9724b1abd732847e"/>
+      <w:bookmarkStart w:id="25" w:name="_f8d2ead443e1df07d65fdecb4523633008dc5d5"/>
       <w:r>
         <w:t xml:space="preserve">3.1 The ReAct Loop &amp; Strict Task Scoping</w:t>
       </w:r>
@@ -5302,7 +5301,7 @@
         <w:pStyle w:val="FirstParagraph"/>
       </w:pPr>
       <w:r>
-        <w:t xml:space="preserve">Ty-Code’s core agent engine executes an iterative</w:t>
+        <w:t xml:space="preserve">Ty-Code's core agent engine executes an iterative</w:t>
       </w:r>
       <w:r>
         <w:t xml:space="preserve"> </w:t>
@@ -5320,15 +5319,15 @@
       <w:r>
         <w:t xml:space="preserve">lifecycle governed by strict capability scoping:</w:t>
       </w:r>
-      <w:r>
-        <w:t xml:space="preserve"> </w:t>
-      </w:r>
-      <w:r>
-        <w:t xml:space="preserve">1.</w:t>
-      </w:r>
-      <w:r>
-        <w:t xml:space="preserve"> </w:t>
-      </w:r>
+    </w:p>
+    <w:p>
+      <w:pPr>
+        <w:pStyle w:val="Compact"/>
+        <w:numPr>
+          <w:ilvl w:val="0"/>
+          <w:numId w:val="1006"/>
+        </w:numPr>
+      </w:pPr>
       <w:r>
         <w:rPr>
           <w:b/>
@@ -5342,15 +5341,15 @@
       <w:r>
         <w:t xml:space="preserve">Ingest workspace state, active diagnostics, LSP symbol references, and prior execution outputs.</w:t>
       </w:r>
-      <w:r>
-        <w:t xml:space="preserve"> </w:t>
-      </w:r>
-      <w:r>
-        <w:t xml:space="preserve">2.</w:t>
-      </w:r>
-      <w:r>
-        <w:t xml:space="preserve"> </w:t>
-      </w:r>
+    </w:p>
+    <w:p>
+      <w:pPr>
+        <w:pStyle w:val="Compact"/>
+        <w:numPr>
+          <w:ilvl w:val="0"/>
+          <w:numId w:val="1006"/>
+        </w:numPr>
+      </w:pPr>
       <w:r>
         <w:rPr>
           <w:b/>
@@ -5376,15 +5375,15 @@
       <w:r>
         <w:t xml:space="preserve">).</w:t>
       </w:r>
-      <w:r>
-        <w:t xml:space="preserve"> </w:t>
-      </w:r>
-      <w:r>
-        <w:t xml:space="preserve">3.</w:t>
-      </w:r>
-      <w:r>
-        <w:t xml:space="preserve"> </w:t>
-      </w:r>
+    </w:p>
+    <w:p>
+      <w:pPr>
+        <w:pStyle w:val="Compact"/>
+        <w:numPr>
+          <w:ilvl w:val="0"/>
+          <w:numId w:val="1006"/>
+        </w:numPr>
+      </w:pPr>
       <w:r>
         <w:rPr>
           <w:b/>
@@ -5398,15 +5397,15 @@
       <w:r>
         <w:t xml:space="preserve">Emit precisely parameterized tool declarations (JSON Schema compliant).</w:t>
       </w:r>
-      <w:r>
-        <w:t xml:space="preserve"> </w:t>
-      </w:r>
-      <w:r>
-        <w:t xml:space="preserve">4.</w:t>
-      </w:r>
-      <w:r>
-        <w:t xml:space="preserve"> </w:t>
-      </w:r>
+    </w:p>
+    <w:p>
+      <w:pPr>
+        <w:pStyle w:val="Compact"/>
+        <w:numPr>
+          <w:ilvl w:val="0"/>
+          <w:numId w:val="1006"/>
+        </w:numPr>
+      </w:pPr>
       <w:r>
         <w:rPr>
           <w:b/>
@@ -5434,7 +5433,7 @@
       <w:pPr>
         <w:pStyle w:val="Heading3"/>
       </w:pPr>
-      <w:bookmarkStart w:id="26" w:name="_6ef2b8f968df3b6f9bcd1d69a9160f8be7c0d05"/>
+      <w:bookmarkStart w:id="26" w:name="_e77dfba316ec8039166086abe89a41195788bad"/>
       <w:r>
         <w:t xml:space="preserve">3.2 Auto-Compaction at 95% Context Capacity</w:t>
       </w:r>
@@ -5445,7 +5444,7 @@
         <w:pStyle w:val="FirstParagraph"/>
       </w:pPr>
       <w:r>
-        <w:t xml:space="preserve">When multi-turn conversations approach 95% of a model’s theoretical context window (</w:t>
+        <w:t xml:space="preserve">When multi-turn conversations approach 95% of a model's theoretical context window (</w:t>
       </w:r>
       <m:oMath>
         <m:sSub>
@@ -5476,104 +5475,13 @@
       <w:r>
         <w:t xml:space="preserve">), the agent invokes autonomous context compaction:</w:t>
       </w:r>
-      <w:r>
-        <w:t xml:space="preserve"> </w:t>
-      </w:r>
-      <w:r>
-        <w:t xml:space="preserve">-</w:t>
-      </w:r>
-      <w:r>
-        <w:t xml:space="preserve"> </w:t>
-      </w:r>
-      <w:r>
-        <w:rPr>
-          <w:b/>
-          <w:bCs/>
-        </w:rPr>
-        <w:t xml:space="preserve">Salience Distillation:</w:t>
-      </w:r>
-      <w:r>
-        <w:t xml:space="preserve"> </w:t>
-      </w:r>
-      <w:r>
-        <w:t xml:space="preserve">Intermediate reasoning chains and redundant tool output dumps (e.g., 2,000-line test runs) are compressed into compact semantic state vectors.</w:t>
-      </w:r>
-      <w:r>
-        <w:t xml:space="preserve"> </w:t>
-      </w:r>
-      <w:r>
-        <w:t xml:space="preserve">-</w:t>
-      </w:r>
-      <w:r>
-        <w:t xml:space="preserve"> </w:t>
-      </w:r>
-      <w:r>
-        <w:rPr>
-          <w:b/>
-          <w:bCs/>
-        </w:rPr>
-        <w:t xml:space="preserve">Invariable Preservation:</w:t>
-      </w:r>
-      <w:r>
-        <w:t xml:space="preserve"> </w:t>
-      </w:r>
-      <w:r>
-        <w:t xml:space="preserve">Current file paths, explicit user constraints, failed hypothesis records, and unfulfilled task requirements are preserved byte-for-byte in a Markdown artifact anchor.</w:t>
-      </w:r>
-      <w:r>
-        <w:t xml:space="preserve"> </w:t>
-      </w:r>
-      <w:r>
-        <w:t xml:space="preserve">-</w:t>
-      </w:r>
-      <w:r>
-        <w:t xml:space="preserve"> </w:t>
-      </w:r>
-      <w:r>
-        <w:rPr>
-          <w:b/>
-          <w:bCs/>
-        </w:rPr>
-        <w:t xml:space="preserve">Lossless Continuation:</w:t>
-      </w:r>
-      <w:r>
-        <w:t xml:space="preserve"> </w:t>
-      </w:r>
-      <w:r>
-        <w:t xml:space="preserve">The token count drops by 65–80%, restoring headroom without resetting conversational memory or requiring a manual</w:t>
-      </w:r>
-      <w:r>
-        <w:t xml:space="preserve"> </w:t>
-      </w:r>
-      <w:r>
-        <w:rPr>
-          <w:rStyle w:val="VerbatimChar"/>
-        </w:rPr>
-        <w:t xml:space="preserve">/sync</w:t>
-      </w:r>
-      <w:r>
-        <w:t xml:space="preserve"> </w:t>
-      </w:r>
-      <w:r>
-        <w:t xml:space="preserve">command.</w:t>
-      </w:r>
-    </w:p>
-    <w:p>
-      <w:pPr>
-        <w:pStyle w:val="Heading3"/>
-      </w:pPr>
-      <w:bookmarkStart w:id="27" w:name="_b26183a8f22e81afa4fbe48bd6963fb4f720b1b"/>
-      <w:r>
-        <w:t xml:space="preserve">3.3 The Ty-Code Context Engine: Universal Correction Memory &amp; Auto-MCP</w:t>
-      </w:r>
-      <w:bookmarkEnd w:id="27"/>
     </w:p>
     <w:p>
       <w:pPr>
         <w:pStyle w:val="Compact"/>
         <w:numPr>
           <w:ilvl w:val="0"/>
-          <w:numId w:val="1002"/>
+          <w:numId w:val="1007"/>
         </w:numPr>
       </w:pPr>
       <w:r>
@@ -5581,58 +5489,13 @@
           <w:b/>
           <w:bCs/>
         </w:rPr>
-        <w:t xml:space="preserve">Universal Correction Memory (The Learning Loop):</w:t>
-      </w:r>
-      <w:r>
-        <w:t xml:space="preserve"> </w:t>
-      </w:r>
-      <w:r>
-        <w:t xml:space="preserve">Developer feedback emitted in the Chat Sidecar, the Omni-Debugger, or the M3E Canvas is codified into an in-memory event bus (</w:t>
-      </w:r>
-      <w:r>
-        <w:rPr>
-          <w:rStyle w:val="VerbatimChar"/>
-        </w:rPr>
-        <w:t xml:space="preserve">onCorrectionAdded</w:t>
-      </w:r>
-      <w:r>
-        <w:t xml:space="preserve">). SQLite ledgers operating under Write-Ahead Logging (</w:t>
-      </w:r>
-      <w:r>
-        <w:rPr>
-          <w:rStyle w:val="VerbatimChar"/>
-        </w:rPr>
-        <w:t xml:space="preserve">PRAGMA journal_mode = WAL;</w:t>
-      </w:r>
-      <w:r>
-        <w:t xml:space="preserve">) synchronize rules across all surfaces with zero telemetry (</w:t>
-      </w:r>
-      <w:r>
-        <w:rPr>
-          <w:rStyle w:val="VerbatimChar"/>
-        </w:rPr>
-        <w:t xml:space="preserve">~/.tycode/workspaces/{hash}/</w:t>
-      </w:r>
-      <w:r>
-        <w:t xml:space="preserve">). A rule established in the chat (</w:t>
-      </w:r>
-      <w:r>
-        <w:t xml:space="preserve">“Never use</w:t>
-      </w:r>
-      <w:r>
-        <w:t xml:space="preserve"> </w:t>
-      </w:r>
-      <w:r>
-        <w:rPr>
-          <w:rStyle w:val="VerbatimChar"/>
-        </w:rPr>
-        <w:t xml:space="preserve">var</w:t>
-      </w:r>
-      <w:r>
-        <w:t xml:space="preserve">”</w:t>
-      </w:r>
-      <w:r>
-        <w:t xml:space="preserve">) is instantly enforced by the architectural debugger and the canvas agent.</w:t>
+        <w:t xml:space="preserve">Salience Distillation:</w:t>
+      </w:r>
+      <w:r>
+        <w:t xml:space="preserve"> </w:t>
+      </w:r>
+      <w:r>
+        <w:t xml:space="preserve">Intermediate reasoning chains and redundant tool output dumps (e.g., 2,000-line test runs) are compressed into compact semantic state vectors.</w:t>
       </w:r>
     </w:p>
     <w:p>
@@ -5640,7 +5503,137 @@
         <w:pStyle w:val="Compact"/>
         <w:numPr>
           <w:ilvl w:val="0"/>
-          <w:numId w:val="1002"/>
+          <w:numId w:val="1007"/>
+        </w:numPr>
+      </w:pPr>
+      <w:r>
+        <w:rPr>
+          <w:b/>
+          <w:bCs/>
+        </w:rPr>
+        <w:t xml:space="preserve">Invariable Preservation:</w:t>
+      </w:r>
+      <w:r>
+        <w:t xml:space="preserve"> </w:t>
+      </w:r>
+      <w:r>
+        <w:t xml:space="preserve">Current file paths, explicit user constraints, failed hypothesis records, and unfulfilled task requirements are preserved byte-for-byte in a Markdown artifact anchor.</w:t>
+      </w:r>
+    </w:p>
+    <w:p>
+      <w:pPr>
+        <w:pStyle w:val="Compact"/>
+        <w:numPr>
+          <w:ilvl w:val="0"/>
+          <w:numId w:val="1007"/>
+        </w:numPr>
+      </w:pPr>
+      <w:r>
+        <w:rPr>
+          <w:b/>
+          <w:bCs/>
+        </w:rPr>
+        <w:t xml:space="preserve">Lossless Continuation:</w:t>
+      </w:r>
+      <w:r>
+        <w:t xml:space="preserve"> </w:t>
+      </w:r>
+      <w:r>
+        <w:t xml:space="preserve">The token count drops by 65–80%, restoring headroom without resetting conversational memory or requiring a manual</w:t>
+      </w:r>
+      <w:r>
+        <w:t xml:space="preserve"> </w:t>
+      </w:r>
+      <w:r>
+        <w:rPr>
+          <w:rStyle w:val="VerbatimChar"/>
+        </w:rPr>
+        <w:t xml:space="preserve">/sync</w:t>
+      </w:r>
+      <w:r>
+        <w:t xml:space="preserve"> </w:t>
+      </w:r>
+      <w:r>
+        <w:t xml:space="preserve">command.</w:t>
+      </w:r>
+    </w:p>
+    <w:p>
+      <w:pPr>
+        <w:pStyle w:val="Heading3"/>
+      </w:pPr>
+      <w:bookmarkStart w:id="27" w:name="_6405a18a9fadae70290bfde1874ed18fe75ec79"/>
+      <w:r>
+        <w:t xml:space="preserve">3.3 The Ty-Code Context Engine: Universal Correction Memory &amp; Auto-MCP</w:t>
+      </w:r>
+      <w:bookmarkEnd w:id="27"/>
+    </w:p>
+    <w:p>
+      <w:pPr>
+        <w:pStyle w:val="Compact"/>
+        <w:numPr>
+          <w:ilvl w:val="0"/>
+          <w:numId w:val="1008"/>
+        </w:numPr>
+      </w:pPr>
+      <w:r>
+        <w:rPr>
+          <w:b/>
+          <w:bCs/>
+        </w:rPr>
+        <w:t xml:space="preserve">Universal Correction Memory (The Learning Loop):</w:t>
+      </w:r>
+      <w:r>
+        <w:t xml:space="preserve"> </w:t>
+      </w:r>
+      <w:r>
+        <w:t xml:space="preserve">Developer feedback emitted in the Chat Sidecar, the Omni-Debugger, or the M3E Canvas is codified into an in-memory event bus (</w:t>
+      </w:r>
+      <w:r>
+        <w:rPr>
+          <w:rStyle w:val="VerbatimChar"/>
+        </w:rPr>
+        <w:t xml:space="preserve">onCorrectionAdded</w:t>
+      </w:r>
+      <w:r>
+        <w:t xml:space="preserve">). SQLite ledgers operating under Write-Ahead Logging (</w:t>
+      </w:r>
+      <w:r>
+        <w:rPr>
+          <w:rStyle w:val="VerbatimChar"/>
+        </w:rPr>
+        <w:t xml:space="preserve">PRAGMA journal_mode = WAL;</w:t>
+      </w:r>
+      <w:r>
+        <w:t xml:space="preserve">) synchronize rules across all surfaces with zero telemetry (</w:t>
+      </w:r>
+      <w:r>
+        <w:rPr>
+          <w:rStyle w:val="VerbatimChar"/>
+        </w:rPr>
+        <w:t xml:space="preserve">~/.tycode/workspaces/{hash}/</w:t>
+      </w:r>
+      <w:r>
+        <w:t xml:space="preserve">). A rule established in the chat ("Never use</w:t>
+      </w:r>
+      <w:r>
+        <w:t xml:space="preserve"> </w:t>
+      </w:r>
+      <w:r>
+        <w:rPr>
+          <w:rStyle w:val="VerbatimChar"/>
+        </w:rPr>
+        <w:t xml:space="preserve">var</w:t>
+      </w:r>
+      <w:r>
+        <w:t xml:space="preserve">") is instantly enforced by the architectural debugger and the canvas agent.</w:t>
+      </w:r>
+    </w:p>
+    <w:p>
+      <w:pPr>
+        <w:pStyle w:val="Compact"/>
+        <w:numPr>
+          <w:ilvl w:val="0"/>
+          <w:numId w:val="1008"/>
         </w:numPr>
       </w:pPr>
       <w:r>
@@ -5668,7 +5661,7 @@
       <w:pPr>
         <w:pStyle w:val="Heading2"/>
       </w:pPr>
-      <w:bookmarkStart w:id="28" w:name="_42bf64b4dd1c8fd51dda87ffb7e4fcccc3b7717"/>
+      <w:bookmarkStart w:id="28" w:name="_49bf7bd80d766cfd60cd7d672045ff010b4c200"/>
       <w:r>
         <w:t xml:space="preserve">4. Open-Source Integration &amp; Multi-Harness Routing</w:t>
       </w:r>
@@ -5678,7 +5671,7 @@
       <w:pPr>
         <w:pStyle w:val="Heading3"/>
       </w:pPr>
-      <w:bookmarkStart w:id="29" w:name="_41de006a809c6e961bdb2ca603872c5ab10651f"/>
+      <w:bookmarkStart w:id="29" w:name="_0102dca34bed872c372622f1e65ea0196ee3012"/>
       <w:r>
         <w:t xml:space="preserve">4.1 Accessing 1.3 Billion Free Tokens Across 11 Harness Environments</w:t>
       </w:r>
@@ -5908,7 +5901,7 @@
       <w:pPr>
         <w:pStyle w:val="Heading3"/>
       </w:pPr>
-      <w:bookmarkStart w:id="30" w:name="_8be25f58e1dc737d0c1a17549bcfacef486a899"/>
+      <w:bookmarkStart w:id="30" w:name="_0c70467a691795da07978b4aa8f673f8b274da1"/>
       <w:r>
         <w:t xml:space="preserve">4.2 Upstream Acknowledgment and Architectural Attribution: free-claude-code (FCC)</w:t>
       </w:r>
@@ -5937,15 +5930,11 @@
       <w:r>
         <w:t xml:space="preserve">project:</w:t>
       </w:r>
-      <w:r>
-        <w:t xml:space="preserve"> </w:t>
-      </w:r>
-      <w:r>
-        <w:t xml:space="preserve">&gt;</w:t>
-      </w:r>
-      <w:r>
-        <w:t xml:space="preserve"> </w:t>
-      </w:r>
+    </w:p>
+    <w:p>
+      <w:pPr>
+        <w:pStyle w:val="BlockText"/>
+      </w:pPr>
       <w:r>
         <w:rPr>
           <w:b/>
@@ -5957,21 +5946,17 @@
         <w:t xml:space="preserve"> </w:t>
       </w:r>
       <w:hyperlink r:id="rId31">
-        <w:r>
-          <w:rPr>
-            <w:rStyle w:val="Hyperlink"/>
-          </w:rPr>
-          <w:t xml:space="preserve">https://github.com/Alishahryar1/free-claude-code.git</w:t>
-        </w:r>
+        <w:hyperlink r:id="rId31">
+          <w:r>
+            <w:rPr>
+              <w:rStyle w:val="Hyperlink"/>
+            </w:rPr>
+            <w:t xml:space="preserve">https://github.com/Alishahryar1/free-claude-code.git</w:t>
+          </w:r>
+        </w:hyperlink>
       </w:hyperlink>
       <w:r>
         <w:br/>
-      </w:r>
-      <w:r>
-        <w:t xml:space="preserve">&gt;</w:t>
-      </w:r>
-      <w:r>
-        <w:t xml:space="preserve"> </w:t>
       </w:r>
       <w:r>
         <w:rPr>
@@ -5988,25 +5973,25 @@
           <w:i/>
           <w:iCs/>
         </w:rPr>
-        <w:t xml:space="preserve">Free-model supply layer powered by free-claude-code (FCC) — AGPL-3.0 / MIT.</w:t>
-      </w:r>
-    </w:p>
-    <w:p>
-      <w:pPr>
-        <w:pStyle w:val="BodyText"/>
-      </w:pPr>
-      <w:r>
-        <w:t xml:space="preserve">Rather than treating open-source tooling as an unvetted dependency, Ty-Code’s engineering team performed an exhaustive architectural adaptation of FCC’s methodologies to meet enterprise procurement standards:</w:t>
-      </w:r>
-      <w:r>
-        <w:t xml:space="preserve"> </w:t>
-      </w:r>
-      <w:r>
-        <w:t xml:space="preserve">1.</w:t>
-      </w:r>
-      <w:r>
-        <w:t xml:space="preserve"> </w:t>
-      </w:r>
+        <w:t xml:space="preserve">Free-model supply layer powered by free-claude-code (FCC), AGPL-3.0 / MIT.</w:t>
+      </w:r>
+    </w:p>
+    <w:p>
+      <w:pPr>
+        <w:pStyle w:val="FirstParagraph"/>
+      </w:pPr>
+      <w:r>
+        <w:t xml:space="preserve">Rather than treating open-source tooling as an unvetted dependency, Ty-Code’s engineering team performed an exhaustive architectural adaptation of FCC's methodologies to meet enterprise procurement standards:</w:t>
+      </w:r>
+    </w:p>
+    <w:p>
+      <w:pPr>
+        <w:pStyle w:val="Compact"/>
+        <w:numPr>
+          <w:ilvl w:val="0"/>
+          <w:numId w:val="1009"/>
+        </w:numPr>
+      </w:pPr>
       <w:r>
         <w:rPr>
           <w:b/>
@@ -6041,15 +6026,15 @@
       <w:r>
         <w:t xml:space="preserve">). Real tokens stream from live endpoints with verified TCP/TLS handshakes.</w:t>
       </w:r>
-      <w:r>
-        <w:t xml:space="preserve"> </w:t>
-      </w:r>
-      <w:r>
-        <w:t xml:space="preserve">2.</w:t>
-      </w:r>
-      <w:r>
-        <w:t xml:space="preserve"> </w:t>
-      </w:r>
+    </w:p>
+    <w:p>
+      <w:pPr>
+        <w:pStyle w:val="Compact"/>
+        <w:numPr>
+          <w:ilvl w:val="0"/>
+          <w:numId w:val="1009"/>
+        </w:numPr>
+      </w:pPr>
       <w:r>
         <w:rPr>
           <w:b/>
@@ -6061,7 +6046,7 @@
         <w:t xml:space="preserve"> </w:t>
       </w:r>
       <w:r>
-        <w:t xml:space="preserve">Commercial enterprise procurement requires strict adherence to provider terms of service. Ty-Code incorporates FCC’s catalog classification matrix: web-scraping and unauthenticated browser session stubs (</w:t>
+        <w:t xml:space="preserve">Commercial enterprise procurement requires strict adherence to provider terms of service. Ty-Code incorporates FCC's catalog classification matrix: web-scraping and unauthenticated browser session stubs (</w:t>
       </w:r>
       <w:r>
         <w:rPr>
@@ -6109,15 +6094,15 @@
       <w:r>
         <w:t xml:space="preserve">. Only fully compliant API endpoints and authorized OAuth device flows are enabled for corporate deployment.</w:t>
       </w:r>
-      <w:r>
-        <w:t xml:space="preserve"> </w:t>
-      </w:r>
-      <w:r>
-        <w:t xml:space="preserve">3.</w:t>
-      </w:r>
-      <w:r>
-        <w:t xml:space="preserve"> </w:t>
-      </w:r>
+    </w:p>
+    <w:p>
+      <w:pPr>
+        <w:pStyle w:val="Compact"/>
+        <w:numPr>
+          <w:ilvl w:val="0"/>
+          <w:numId w:val="1009"/>
+        </w:numPr>
+      </w:pPr>
       <w:r>
         <w:rPr>
           <w:b/>
@@ -6131,15 +6116,15 @@
       <w:r>
         <w:t xml:space="preserve">Ty-Code extends the FCC protocol router to synchronize voice-frequency token payloads directly with local Whisper and TTS pipelines, enabling latency-free bidirectional voice pair-programming.</w:t>
       </w:r>
-      <w:r>
-        <w:t xml:space="preserve"> </w:t>
-      </w:r>
-      <w:r>
-        <w:t xml:space="preserve">4.</w:t>
-      </w:r>
-      <w:r>
-        <w:t xml:space="preserve"> </w:t>
-      </w:r>
+    </w:p>
+    <w:p>
+      <w:pPr>
+        <w:pStyle w:val="Compact"/>
+        <w:numPr>
+          <w:ilvl w:val="0"/>
+          <w:numId w:val="1009"/>
+        </w:numPr>
+      </w:pPr>
       <w:r>
         <w:rPr>
           <w:b/>
@@ -6167,7 +6152,7 @@
       <w:pPr>
         <w:pStyle w:val="Heading3"/>
       </w:pPr>
-      <w:bookmarkStart w:id="32" w:name="_7a9b621af70d916c98bb5e2a75441dec127fea7"/>
+      <w:bookmarkStart w:id="32" w:name="_53e81ebacf39d7ab2f837e331d083c81fa6e575"/>
       <w:r>
         <w:t xml:space="preserve">4.3 Strategic Value for Enterprise Procurement</w:t>
       </w:r>
@@ -6180,15 +6165,15 @@
       <w:r>
         <w:t xml:space="preserve">By standardizing on this hardened open-source integration layer:</w:t>
       </w:r>
-      <w:r>
-        <w:t xml:space="preserve"> </w:t>
-      </w:r>
-      <w:r>
-        <w:t xml:space="preserve">-</w:t>
-      </w:r>
-      <w:r>
-        <w:t xml:space="preserve"> </w:t>
-      </w:r>
+    </w:p>
+    <w:p>
+      <w:pPr>
+        <w:pStyle w:val="Compact"/>
+        <w:numPr>
+          <w:ilvl w:val="0"/>
+          <w:numId w:val="1010"/>
+        </w:numPr>
+      </w:pPr>
       <w:r>
         <w:rPr>
           <w:b/>
@@ -6202,15 +6187,15 @@
       <w:r>
         <w:t xml:space="preserve">Development teams can execute broad code refactoring and test-generation passes against high-speed free tiers (e.g., Cerebras Llama-3.3 70B running at 1,500 tokens/sec or Groq at 300 tokens/sec) before committing final review passes to premium proprietary models.</w:t>
       </w:r>
-      <w:r>
-        <w:t xml:space="preserve"> </w:t>
-      </w:r>
-      <w:r>
-        <w:t xml:space="preserve">-</w:t>
-      </w:r>
-      <w:r>
-        <w:t xml:space="preserve"> </w:t>
-      </w:r>
+    </w:p>
+    <w:p>
+      <w:pPr>
+        <w:pStyle w:val="Compact"/>
+        <w:numPr>
+          <w:ilvl w:val="0"/>
+          <w:numId w:val="1010"/>
+        </w:numPr>
+      </w:pPr>
       <w:r>
         <w:rPr>
           <w:b/>
@@ -6224,15 +6209,15 @@
       <w:r>
         <w:t xml:space="preserve">Outages in commercial clouds automatically pivot to alternate open model providers within 50ms, eliminating developer downtime.</w:t>
       </w:r>
-      <w:r>
-        <w:t xml:space="preserve"> </w:t>
-      </w:r>
-      <w:r>
-        <w:t xml:space="preserve">-</w:t>
-      </w:r>
-      <w:r>
-        <w:t xml:space="preserve"> </w:t>
-      </w:r>
+    </w:p>
+    <w:p>
+      <w:pPr>
+        <w:pStyle w:val="Compact"/>
+        <w:numPr>
+          <w:ilvl w:val="0"/>
+          <w:numId w:val="1010"/>
+        </w:numPr>
+      </w:pPr>
       <w:r>
         <w:rPr>
           <w:b/>
@@ -6258,7 +6243,7 @@
       <w:pPr>
         <w:pStyle w:val="Heading2"/>
       </w:pPr>
-      <w:bookmarkStart w:id="33" w:name="_51c0a0f4a75c68a2c59118a2483aebf8e15f722"/>
+      <w:bookmarkStart w:id="33" w:name="_13439b4957ed9d43a3536574422a516c6142ff7"/>
       <w:r>
         <w:t xml:space="preserve">5. Enterprise Deployment &amp; MDM Integration</w:t>
       </w:r>
@@ -6268,7 +6253,7 @@
       <w:pPr>
         <w:pStyle w:val="Heading3"/>
       </w:pPr>
-      <w:bookmarkStart w:id="34" w:name="_1262c0dde3e34edc15de460cd2d2ee3bcc01606"/>
+      <w:bookmarkStart w:id="34" w:name="_edd20fc3e4ad86556578da9c39e748e4becd24c"/>
       <w:r>
         <w:t xml:space="preserve">5.1 Centralized Policy Distribution</w:t>
       </w:r>
@@ -6289,15 +6274,15 @@
       <w:r>
         <w:t xml:space="preserve">Policy files are written to system-immutable locations:</w:t>
       </w:r>
-      <w:r>
-        <w:t xml:space="preserve"> </w:t>
-      </w:r>
-      <w:r>
-        <w:t xml:space="preserve">-</w:t>
-      </w:r>
-      <w:r>
-        <w:t xml:space="preserve"> </w:t>
-      </w:r>
+    </w:p>
+    <w:p>
+      <w:pPr>
+        <w:pStyle w:val="Compact"/>
+        <w:numPr>
+          <w:ilvl w:val="0"/>
+          <w:numId w:val="1011"/>
+        </w:numPr>
+      </w:pPr>
       <w:r>
         <w:rPr>
           <w:b/>
@@ -6314,15 +6299,15 @@
         </w:rPr>
         <w:t xml:space="preserve">HKLM\Software\Policies\TyCode\policy.json</w:t>
       </w:r>
-      <w:r>
-        <w:t xml:space="preserve"> </w:t>
-      </w:r>
-      <w:r>
-        <w:t xml:space="preserve">-</w:t>
-      </w:r>
-      <w:r>
-        <w:t xml:space="preserve"> </w:t>
-      </w:r>
+    </w:p>
+    <w:p>
+      <w:pPr>
+        <w:pStyle w:val="Compact"/>
+        <w:numPr>
+          <w:ilvl w:val="0"/>
+          <w:numId w:val="1011"/>
+        </w:numPr>
+      </w:pPr>
       <w:r>
         <w:rPr>
           <w:b/>
@@ -6360,15 +6345,15 @@
       <w:r>
         <w:t xml:space="preserve">profiles)</w:t>
       </w:r>
-      <w:r>
-        <w:t xml:space="preserve"> </w:t>
-      </w:r>
-      <w:r>
-        <w:t xml:space="preserve">-</w:t>
-      </w:r>
-      <w:r>
-        <w:t xml:space="preserve"> </w:t>
-      </w:r>
+    </w:p>
+    <w:p>
+      <w:pPr>
+        <w:pStyle w:val="Compact"/>
+        <w:numPr>
+          <w:ilvl w:val="0"/>
+          <w:numId w:val="1011"/>
+        </w:numPr>
+      </w:pPr>
       <w:r>
         <w:rPr>
           <w:b/>
@@ -7232,7 +7217,7 @@
       <w:pPr>
         <w:pStyle w:val="Heading3"/>
       </w:pPr>
-      <w:bookmarkStart w:id="35" w:name="_8e9fafe48a4ce1ce0562cafb3a4399e4126e92d"/>
+      <w:bookmarkStart w:id="35" w:name="_744e5a0c2a798db0db9864318a7e837f283e371"/>
       <w:r>
         <w:t xml:space="preserve">5.2 Private LLM Proxies &amp; Air-Gapped Operation</w:t>
       </w:r>
@@ -7260,17 +7245,29 @@
       <w:r>
         <w:t xml:space="preserve">is asserted:</w:t>
       </w:r>
-      <w:r>
-        <w:t xml:space="preserve"> </w:t>
-      </w:r>
-      <w:r>
-        <w:t xml:space="preserve">1. Ty-Code disables all outbound commercial WAN egress calls.</w:t>
-      </w:r>
-      <w:r>
-        <w:t xml:space="preserve"> </w:t>
-      </w:r>
-      <w:r>
-        <w:t xml:space="preserve">2. The</w:t>
+    </w:p>
+    <w:p>
+      <w:pPr>
+        <w:pStyle w:val="Compact"/>
+        <w:numPr>
+          <w:ilvl w:val="0"/>
+          <w:numId w:val="1012"/>
+        </w:numPr>
+      </w:pPr>
+      <w:r>
+        <w:t xml:space="preserve">Ty-Code disables all outbound commercial WAN egress calls.</w:t>
+      </w:r>
+    </w:p>
+    <w:p>
+      <w:pPr>
+        <w:pStyle w:val="Compact"/>
+        <w:numPr>
+          <w:ilvl w:val="0"/>
+          <w:numId w:val="1012"/>
+        </w:numPr>
+      </w:pPr>
+      <w:r>
+        <w:t xml:space="preserve">The</w:t>
       </w:r>
       <w:r>
         <w:t xml:space="preserve"> </w:t>
@@ -7287,17 +7284,29 @@
       <w:r>
         <w:t xml:space="preserve">re-routes all AST queries, agent tool calls, and completions through the corporate Private LLM Gateway (e.g., LiteLLM, vLLM, or Amazon Bedrock PrivateLink endpoints).</w:t>
       </w:r>
-      <w:r>
-        <w:t xml:space="preserve"> </w:t>
-      </w:r>
-      <w:r>
-        <w:t xml:space="preserve">3. Corporate SSL inspection certificates loaded into the OS Trust Store are natively honored via Electron’s secure certificate verification delegates.</w:t>
-      </w:r>
-      <w:r>
-        <w:t xml:space="preserve"> </w:t>
-      </w:r>
-      <w:r>
-        <w:t xml:space="preserve">4. In complete air-gapped secure rooms (SCIF environments), Ty-Code runs entirely against on-host Ollama or vLLM instances with zero network interfaces active.</w:t>
+    </w:p>
+    <w:p>
+      <w:pPr>
+        <w:pStyle w:val="Compact"/>
+        <w:numPr>
+          <w:ilvl w:val="0"/>
+          <w:numId w:val="1012"/>
+        </w:numPr>
+      </w:pPr>
+      <w:r>
+        <w:t xml:space="preserve">Corporate SSL inspection certificates loaded into the OS Trust Store are natively honored via Electron's secure certificate verification delegates.</w:t>
+      </w:r>
+    </w:p>
+    <w:p>
+      <w:pPr>
+        <w:pStyle w:val="Compact"/>
+        <w:numPr>
+          <w:ilvl w:val="0"/>
+          <w:numId w:val="1012"/>
+        </w:numPr>
+      </w:pPr>
+      <w:r>
+        <w:t xml:space="preserve">In complete air-gapped secure rooms (SCIF environments), Ty-Code runs entirely against on-host Ollama or vLLM instances with zero network interfaces active.</w:t>
       </w:r>
     </w:p>
     <w:p>
@@ -7311,7 +7320,7 @@
       <w:pPr>
         <w:pStyle w:val="Heading2"/>
       </w:pPr>
-      <w:bookmarkStart w:id="36" w:name="_db2df72c2d64076fb4d03e7e062549fa7e88ac7"/>
+      <w:bookmarkStart w:id="36" w:name="_d2405f5f7f0d9f72396882fffb3faec56c2357d"/>
       <w:r>
         <w:t xml:space="preserve">6. Empirical Verification &amp; Anti-Phantom Audit Evidence</w:t>
       </w:r>
@@ -7328,516 +7337,7 @@
     <w:tbl>
       <w:tblPr>
         <w:tblStyle w:val="Table"/>
-        <w:tblW w:type="pct" w:w="5000"/>
-        <w:tblLayout w:type="fixed"/>
-        <w:tblLook w:firstRow="1" w:lastRow="0" w:firstColumn="0" w:lastColumn="0" w:noHBand="0" w:noVBand="0" w:val="0020"/>
-      </w:tblPr>
-      <w:tblGrid>
-        <w:gridCol w:w="1697"/>
-        <w:gridCol w:w="1697"/>
-        <w:gridCol w:w="1697"/>
-        <w:gridCol w:w="2828"/>
-      </w:tblGrid>
-      <w:tr>
-        <w:trPr>
-          <w:tblHeader w:val="on"/>
-        </w:trPr>
-        <w:tc>
-          <w:tcPr/>
-          <w:p>
-            <w:pPr>
-              <w:pStyle w:val="Compact"/>
-            </w:pPr>
-            <w:r>
-              <w:t xml:space="preserve">Security Assertion</w:t>
-            </w:r>
-          </w:p>
-        </w:tc>
-        <w:tc>
-          <w:tcPr/>
-          <w:p>
-            <w:pPr>
-              <w:pStyle w:val="Compact"/>
-            </w:pPr>
-            <w:r>
-              <w:t xml:space="preserve">Verification Command</w:t>
-            </w:r>
-          </w:p>
-        </w:tc>
-        <w:tc>
-          <w:tcPr/>
-          <w:p>
-            <w:pPr>
-              <w:pStyle w:val="Compact"/>
-            </w:pPr>
-            <w:r>
-              <w:t xml:space="preserve">Artifact Evidence Path</w:t>
-            </w:r>
-          </w:p>
-        </w:tc>
-        <w:tc>
-          <w:tcPr/>
-          <w:p>
-            <w:pPr>
-              <w:pStyle w:val="Compact"/>
-              <w:jc w:val="center"/>
-            </w:pPr>
-            <w:r>
-              <w:t xml:space="preserve">Audit Status</w:t>
-            </w:r>
-          </w:p>
-        </w:tc>
-      </w:tr>
-      <w:tr>
-        <w:tc>
-          <w:tcPr/>
-          <w:p>
-            <w:pPr>
-              <w:pStyle w:val="Compact"/>
-            </w:pPr>
-            <w:r>
-              <w:rPr>
-                <w:b/>
-                <w:bCs/>
-              </w:rPr>
-              <w:t xml:space="preserve">Zero Mock Code Paths</w:t>
-            </w:r>
-          </w:p>
-        </w:tc>
-        <w:tc>
-          <w:tcPr/>
-          <w:p>
-            <w:pPr>
-              <w:pStyle w:val="Compact"/>
-            </w:pPr>
-            <w:r>
-              <w:rPr>
-                <w:rStyle w:val="VerbatimChar"/>
-              </w:rPr>
-              <w:t xml:space="preserve">node scripts/no-mock-agent-path.mjs</w:t>
-            </w:r>
-          </w:p>
-        </w:tc>
-        <w:tc>
-          <w:tcPr/>
-          <w:p>
-            <w:pPr>
-              <w:pStyle w:val="Compact"/>
-            </w:pPr>
-            <w:r>
-              <w:rPr>
-                <w:rStyle w:val="VerbatimChar"/>
-              </w:rPr>
-              <w:t xml:space="preserve">docs/traces/mock-elimination.json</w:t>
-            </w:r>
-          </w:p>
-        </w:tc>
-        <w:tc>
-          <w:tcPr/>
-          <w:p>
-            <w:pPr>
-              <w:pStyle w:val="Compact"/>
-              <w:jc w:val="center"/>
-            </w:pPr>
-            <w:r>
-              <w:rPr>
-                <w:b/>
-                <w:bCs/>
-              </w:rPr>
-              <w:t xml:space="preserve">VERIFIED CLEAN (0 Violations)</w:t>
-            </w:r>
-          </w:p>
-        </w:tc>
-      </w:tr>
-      <w:tr>
-        <w:tc>
-          <w:tcPr/>
-          <w:p>
-            <w:pPr>
-              <w:pStyle w:val="Compact"/>
-            </w:pPr>
-            <w:r>
-              <w:rPr>
-                <w:b/>
-                <w:bCs/>
-              </w:rPr>
-              <w:t xml:space="preserve">No Fixture Strings</w:t>
-            </w:r>
-          </w:p>
-        </w:tc>
-        <w:tc>
-          <w:tcPr/>
-          <w:p>
-            <w:pPr>
-              <w:pStyle w:val="Compact"/>
-            </w:pPr>
-            <w:r>
-              <w:rPr>
-                <w:rStyle w:val="VerbatimChar"/>
-              </w:rPr>
-              <w:t xml:space="preserve">node scripts/no-fixture-replies.mjs</w:t>
-            </w:r>
-          </w:p>
-        </w:tc>
-        <w:tc>
-          <w:tcPr/>
-          <w:p>
-            <w:pPr>
-              <w:pStyle w:val="Compact"/>
-            </w:pPr>
-            <w:r>
-              <w:rPr>
-                <w:rStyle w:val="VerbatimChar"/>
-              </w:rPr>
-              <w:t xml:space="preserve">docs/traces/mock-elimination.json</w:t>
-            </w:r>
-          </w:p>
-        </w:tc>
-        <w:tc>
-          <w:tcPr/>
-          <w:p>
-            <w:pPr>
-              <w:pStyle w:val="Compact"/>
-              <w:jc w:val="center"/>
-            </w:pPr>
-            <w:r>
-              <w:rPr>
-                <w:b/>
-                <w:bCs/>
-              </w:rPr>
-              <w:t xml:space="preserve">VERIFIED CLEAN (230 Files Clean)</w:t>
-            </w:r>
-          </w:p>
-        </w:tc>
-      </w:tr>
-      <w:tr>
-        <w:tc>
-          <w:tcPr/>
-          <w:p>
-            <w:pPr>
-              <w:pStyle w:val="Compact"/>
-            </w:pPr>
-            <w:r>
-              <w:rPr>
-                <w:b/>
-                <w:bCs/>
-              </w:rPr>
-              <w:t xml:space="preserve">No Plaintext Secrets</w:t>
-            </w:r>
-          </w:p>
-        </w:tc>
-        <w:tc>
-          <w:tcPr/>
-          <w:p>
-            <w:pPr>
-              <w:pStyle w:val="Compact"/>
-            </w:pPr>
-            <w:r>
-              <w:rPr>
-                <w:rStyle w:val="VerbatimChar"/>
-              </w:rPr>
-              <w:t xml:space="preserve">node scripts/no-baked-secrets.mjs</w:t>
-            </w:r>
-          </w:p>
-        </w:tc>
-        <w:tc>
-          <w:tcPr/>
-          <w:p>
-            <w:pPr>
-              <w:pStyle w:val="Compact"/>
-            </w:pPr>
-            <w:r>
-              <w:rPr>
-                <w:rStyle w:val="VerbatimChar"/>
-              </w:rPr>
-              <w:t xml:space="preserve">docs/traces/credential-security.json</w:t>
-            </w:r>
-          </w:p>
-        </w:tc>
-        <w:tc>
-          <w:tcPr/>
-          <w:p>
-            <w:pPr>
-              <w:pStyle w:val="Compact"/>
-              <w:jc w:val="center"/>
-            </w:pPr>
-            <w:r>
-              <w:rPr>
-                <w:b/>
-                <w:bCs/>
-              </w:rPr>
-              <w:t xml:space="preserve">VERIFIED CLEAN (0 Secrets Found)</w:t>
-            </w:r>
-          </w:p>
-        </w:tc>
-      </w:tr>
-      <w:tr>
-        <w:tc>
-          <w:tcPr/>
-          <w:p>
-            <w:pPr>
-              <w:pStyle w:val="Compact"/>
-            </w:pPr>
-            <w:r>
-              <w:rPr>
-                <w:b/>
-                <w:bCs/>
-              </w:rPr>
-              <w:t xml:space="preserve">Hardware Key Privacy</w:t>
-            </w:r>
-          </w:p>
-        </w:tc>
-        <w:tc>
-          <w:tcPr/>
-          <w:p>
-            <w:pPr>
-              <w:pStyle w:val="Compact"/>
-            </w:pPr>
-            <w:r>
-              <w:rPr>
-                <w:rStyle w:val="VerbatimChar"/>
-              </w:rPr>
-              <w:t xml:space="preserve">node scripts/verify-audit-artifacts.mjs</w:t>
-            </w:r>
-          </w:p>
-        </w:tc>
-        <w:tc>
-          <w:tcPr/>
-          <w:p>
-            <w:pPr>
-              <w:pStyle w:val="Compact"/>
-            </w:pPr>
-            <w:r>
-              <w:rPr>
-                <w:rStyle w:val="VerbatimChar"/>
-              </w:rPr>
-              <w:t xml:space="preserve">docs/traces/connectivity-trace.json</w:t>
-            </w:r>
-          </w:p>
-        </w:tc>
-        <w:tc>
-          <w:tcPr/>
-          <w:p>
-            <w:pPr>
-              <w:pStyle w:val="Compact"/>
-              <w:jc w:val="center"/>
-            </w:pPr>
-            <w:r>
-              <w:rPr>
-                <w:b/>
-                <w:bCs/>
-              </w:rPr>
-              <w:t xml:space="preserve">VERIFIED (0 Raw Keys Exposed)</w:t>
-            </w:r>
-          </w:p>
-        </w:tc>
-      </w:tr>
-      <w:tr>
-        <w:tc>
-          <w:tcPr/>
-          <w:p>
-            <w:pPr>
-              <w:pStyle w:val="Compact"/>
-            </w:pPr>
-            <w:r>
-              <w:rPr>
-                <w:b/>
-                <w:bCs/>
-              </w:rPr>
-              <w:t xml:space="preserve">Open-Path Perf Budgets</w:t>
-            </w:r>
-          </w:p>
-        </w:tc>
-        <w:tc>
-          <w:tcPr/>
-          <w:p>
-            <w:pPr>
-              <w:pStyle w:val="Compact"/>
-            </w:pPr>
-            <w:r>
-              <w:rPr>
-                <w:rStyle w:val="VerbatimChar"/>
-              </w:rPr>
-              <w:t xml:space="preserve">node scripts/run-live-e2e.mjs</w:t>
-            </w:r>
-          </w:p>
-        </w:tc>
-        <w:tc>
-          <w:tcPr/>
-          <w:p>
-            <w:pPr>
-              <w:pStyle w:val="Compact"/>
-            </w:pPr>
-            <w:r>
-              <w:rPr>
-                <w:rStyle w:val="VerbatimChar"/>
-              </w:rPr>
-              <w:t xml:space="preserve">docs/traces/open-perf-trace.json</w:t>
-            </w:r>
-          </w:p>
-        </w:tc>
-        <w:tc>
-          <w:tcPr/>
-          <w:p>
-            <w:pPr>
-              <w:pStyle w:val="Compact"/>
-              <w:jc w:val="center"/>
-            </w:pPr>
-            <w:r>
-              <w:rPr>
-                <w:b/>
-                <w:bCs/>
-              </w:rPr>
-              <w:t xml:space="preserve">VERIFIED (&lt;1500ms 10k Tree Paint)</w:t>
-            </w:r>
-          </w:p>
-        </w:tc>
-      </w:tr>
-      <w:tr>
-        <w:tc>
-          <w:tcPr/>
-          <w:p>
-            <w:pPr>
-              <w:pStyle w:val="Compact"/>
-            </w:pPr>
-            <w:r>
-              <w:rPr>
-                <w:b/>
-                <w:bCs/>
-              </w:rPr>
-              <w:t xml:space="preserve">100% FCC Coverage Matrix</w:t>
-            </w:r>
-          </w:p>
-        </w:tc>
-        <w:tc>
-          <w:tcPr/>
-          <w:p>
-            <w:pPr>
-              <w:pStyle w:val="Compact"/>
-            </w:pPr>
-            <w:r>
-              <w:rPr>
-                <w:rStyle w:val="VerbatimChar"/>
-              </w:rPr>
-              <w:t xml:space="preserve">node scripts/verify-fcc-coverage.mjs</w:t>
-            </w:r>
-          </w:p>
-        </w:tc>
-        <w:tc>
-          <w:tcPr/>
-          <w:p>
-            <w:pPr>
-              <w:pStyle w:val="Compact"/>
-            </w:pPr>
-            <w:r>
-              <w:rPr>
-                <w:rStyle w:val="VerbatimChar"/>
-              </w:rPr>
-              <w:t xml:space="preserve">docs/traces/fcc-coverage.json</w:t>
-            </w:r>
-          </w:p>
-        </w:tc>
-        <w:tc>
-          <w:tcPr/>
-          <w:p>
-            <w:pPr>
-              <w:pStyle w:val="Compact"/>
-              <w:jc w:val="center"/>
-            </w:pPr>
-            <w:r>
-              <w:rPr>
-                <w:b/>
-                <w:bCs/>
-              </w:rPr>
-              <w:t xml:space="preserve">VERIFIED (12/12 Capabilities Pass)</w:t>
-            </w:r>
-          </w:p>
-        </w:tc>
-      </w:tr>
-      <w:tr>
-        <w:tc>
-          <w:tcPr/>
-          <w:p>
-            <w:pPr>
-              <w:pStyle w:val="Compact"/>
-            </w:pPr>
-            <w:r>
-              <w:rPr>
-                <w:b/>
-                <w:bCs/>
-              </w:rPr>
-              <w:t xml:space="preserve">Sandbox &amp; AST Escapes</w:t>
-            </w:r>
-          </w:p>
-        </w:tc>
-        <w:tc>
-          <w:tcPr/>
-          <w:p>
-            <w:pPr>
-              <w:pStyle w:val="Compact"/>
-            </w:pPr>
-            <w:r>
-              <w:rPr>
-                <w:rStyle w:val="VerbatimChar"/>
-              </w:rPr>
-              <w:t xml:space="preserve">node scripts/run-extension-security.mjs</w:t>
-            </w:r>
-          </w:p>
-        </w:tc>
-        <w:tc>
-          <w:tcPr/>
-          <w:p>
-            <w:pPr>
-              <w:pStyle w:val="Compact"/>
-            </w:pPr>
-            <w:r>
-              <w:rPr>
-                <w:rStyle w:val="VerbatimChar"/>
-              </w:rPr>
-              <w:t xml:space="preserve">docs/traces/extension-security.json</w:t>
-            </w:r>
-          </w:p>
-        </w:tc>
-        <w:tc>
-          <w:tcPr/>
-          <w:p>
-            <w:pPr>
-              <w:pStyle w:val="Compact"/>
-              <w:jc w:val="center"/>
-            </w:pPr>
-            <w:r>
-              <w:rPr>
-                <w:b/>
-                <w:bCs/>
-              </w:rPr>
-              <w:t xml:space="preserve">VERIFIED (100% Capability Containment)</w:t>
-            </w:r>
-          </w:p>
-        </w:tc>
-      </w:tr>
-    </w:tbl>
-    <w:p>
-      <w:r>
-        <w:pict>
-          <v:rect style="width:0;height:1.5pt" o:hralign="center" o:hrstd="t" o:hr="t"/>
-        </w:pict>
-      </w:r>
-    </w:p>
-    <w:p>
-      <w:pPr>
-        <w:pStyle w:val="Heading2"/>
-      </w:pPr>
-      <w:bookmarkStart w:id="37" w:name="_507fa95aeaf9814d908b226c6e8b610a7654494"/>
-      <w:r>
-        <w:t xml:space="preserve">7. Comparative Architectural Matrix</w:t>
-      </w:r>
-      <w:bookmarkEnd w:id="37"/>
-    </w:p>
-    <w:tbl>
-      <w:tblPr>
-        <w:tblStyle w:val="Table"/>
-        <w:tblW w:type="pct" w:w="5000"/>
-        <w:tblLayout w:type="fixed"/>
+        <w:tblW w:type="auto" w:w="0"/>
         <w:tblLook w:firstRow="1" w:lastRow="0" w:firstColumn="0" w:lastColumn="0" w:noHBand="0" w:noVBand="0" w:val="0020"/>
       </w:tblPr>
       <w:tblGrid>
@@ -7857,7 +7357,7 @@
               <w:pStyle w:val="Compact"/>
             </w:pPr>
             <w:r>
-              <w:t xml:space="preserve">Architectural Vector</w:t>
+              <w:t xml:space="preserve">Security Assertion</w:t>
             </w:r>
           </w:p>
         </w:tc>
@@ -7868,7 +7368,7 @@
               <w:pStyle w:val="Compact"/>
             </w:pPr>
             <w:r>
-              <w:t xml:space="preserve">Cloud-Centric AI IDEs (Copilot, Cursor)</w:t>
+              <w:t xml:space="preserve">Verification Command</w:t>
             </w:r>
           </w:p>
         </w:tc>
@@ -7879,7 +7379,7 @@
               <w:pStyle w:val="Compact"/>
             </w:pPr>
             <w:r>
-              <w:t xml:space="preserve">Generic Open-Source Wrappers</w:t>
+              <w:t xml:space="preserve">Artifact Evidence Path</w:t>
             </w:r>
           </w:p>
         </w:tc>
@@ -7888,9 +7388,10 @@
           <w:p>
             <w:pPr>
               <w:pStyle w:val="Compact"/>
+              <w:jc w:val="center"/>
             </w:pPr>
             <w:r>
-              <w:t xml:space="preserve">Ty-Code Enterprise</w:t>
+              <w:t xml:space="preserve">Audit Status</w:t>
             </w:r>
           </w:p>
         </w:tc>
@@ -7907,7 +7408,7 @@
                 <w:b/>
                 <w:bCs/>
               </w:rPr>
-              <w:t xml:space="preserve">Data Residency</w:t>
+              <w:t xml:space="preserve">Zero Mock Code Paths</w:t>
             </w:r>
           </w:p>
         </w:tc>
@@ -7918,7 +7419,10 @@
               <w:pStyle w:val="Compact"/>
             </w:pPr>
             <w:r>
-              <w:t xml:space="preserve">Third-party multitenant cloud servers</w:t>
+              <w:rPr>
+                <w:rStyle w:val="VerbatimChar"/>
+              </w:rPr>
+              <w:t xml:space="preserve">node scripts/no-mock-agent-path.mjs</w:t>
             </w:r>
           </w:p>
         </w:tc>
@@ -7929,7 +7433,10 @@
               <w:pStyle w:val="Compact"/>
             </w:pPr>
             <w:r>
-              <w:t xml:space="preserve">Variable / unmanaged</w:t>
+              <w:rPr>
+                <w:rStyle w:val="VerbatimChar"/>
+              </w:rPr>
+              <w:t xml:space="preserve">docs/traces/mock-elimination.json</w:t>
             </w:r>
           </w:p>
         </w:tc>
@@ -7938,13 +7445,14 @@
           <w:p>
             <w:pPr>
               <w:pStyle w:val="Compact"/>
+              <w:jc w:val="center"/>
             </w:pPr>
             <w:r>
               <w:rPr>
                 <w:b/>
                 <w:bCs/>
               </w:rPr>
-              <w:t xml:space="preserve">100% Local-First / Private Gateway</w:t>
+              <w:t xml:space="preserve">VERIFIED CLEAN (0 Violations)</w:t>
             </w:r>
           </w:p>
         </w:tc>
@@ -7961,7 +7469,7 @@
                 <w:b/>
                 <w:bCs/>
               </w:rPr>
-              <w:t xml:space="preserve">Credential Storage</w:t>
+              <w:t xml:space="preserve">No Fixture Strings</w:t>
             </w:r>
           </w:p>
         </w:tc>
@@ -7972,7 +7480,10 @@
               <w:pStyle w:val="Compact"/>
             </w:pPr>
             <w:r>
-              <w:t xml:space="preserve">Plaintext config files / token cookies</w:t>
+              <w:rPr>
+                <w:rStyle w:val="VerbatimChar"/>
+              </w:rPr>
+              <w:t xml:space="preserve">node scripts/no-fixture-replies.mjs</w:t>
             </w:r>
           </w:p>
         </w:tc>
@@ -7983,22 +7494,10 @@
               <w:pStyle w:val="Compact"/>
             </w:pPr>
             <w:r>
-              <w:t xml:space="preserve">Plaintext</w:t>
-            </w:r>
-            <w:r>
-              <w:t xml:space="preserve"> </w:t>
-            </w:r>
-            <w:r>
               <w:rPr>
                 <w:rStyle w:val="VerbatimChar"/>
               </w:rPr>
-              <w:t xml:space="preserve">.env</w:t>
-            </w:r>
-            <w:r>
-              <w:t xml:space="preserve"> </w:t>
-            </w:r>
-            <w:r>
-              <w:t xml:space="preserve">files</w:t>
+              <w:t xml:space="preserve">docs/traces/mock-elimination.json</w:t>
             </w:r>
           </w:p>
         </w:tc>
@@ -8007,28 +7506,14 @@
           <w:p>
             <w:pPr>
               <w:pStyle w:val="Compact"/>
+              <w:jc w:val="center"/>
             </w:pPr>
             <w:r>
               <w:rPr>
                 <w:b/>
                 <w:bCs/>
               </w:rPr>
-              <w:t xml:space="preserve">OS-Level Hardware Vault (</w:t>
-            </w:r>
-            <w:r>
-              <w:rPr>
-                <w:rStyle w:val="VerbatimChar"/>
-                <w:b/>
-                <w:bCs/>
-              </w:rPr>
-              <w:t xml:space="preserve">safeStorage</w:t>
-            </w:r>
-            <w:r>
-              <w:rPr>
-                <w:b/>
-                <w:bCs/>
-              </w:rPr>
-              <w:t xml:space="preserve">)</w:t>
+              <w:t xml:space="preserve">VERIFIED CLEAN (230 Files Clean)</w:t>
             </w:r>
           </w:p>
         </w:tc>
@@ -8045,7 +7530,7 @@
                 <w:b/>
                 <w:bCs/>
               </w:rPr>
-              <w:t xml:space="preserve">Process Isolation</w:t>
+              <w:t xml:space="preserve">No Plaintext Secrets</w:t>
             </w:r>
           </w:p>
         </w:tc>
@@ -8056,7 +7541,10 @@
               <w:pStyle w:val="Compact"/>
             </w:pPr>
             <w:r>
-              <w:t xml:space="preserve">Monolithic or standard web views</w:t>
+              <w:rPr>
+                <w:rStyle w:val="VerbatimChar"/>
+              </w:rPr>
+              <w:t xml:space="preserve">node scripts/no-baked-secrets.mjs</w:t>
             </w:r>
           </w:p>
         </w:tc>
@@ -8067,7 +7555,10 @@
               <w:pStyle w:val="Compact"/>
             </w:pPr>
             <w:r>
-              <w:t xml:space="preserve">Unchecked Node.js scripts</w:t>
+              <w:rPr>
+                <w:rStyle w:val="VerbatimChar"/>
+              </w:rPr>
+              <w:t xml:space="preserve">docs/traces/credential-security.json</w:t>
             </w:r>
           </w:p>
         </w:tc>
@@ -8076,13 +7567,14 @@
           <w:p>
             <w:pPr>
               <w:pStyle w:val="Compact"/>
+              <w:jc w:val="center"/>
             </w:pPr>
             <w:r>
               <w:rPr>
                 <w:b/>
                 <w:bCs/>
               </w:rPr>
-              <w:t xml:space="preserve">Chromium Sandbox + contextBridge + Zod</w:t>
+              <w:t xml:space="preserve">VERIFIED CLEAN (0 Secrets Found)</w:t>
             </w:r>
           </w:p>
         </w:tc>
@@ -8099,7 +7591,7 @@
                 <w:b/>
                 <w:bCs/>
               </w:rPr>
-              <w:t xml:space="preserve">Terminal Execution</w:t>
+              <w:t xml:space="preserve">Hardware Key Privacy</w:t>
             </w:r>
           </w:p>
         </w:tc>
@@ -8110,7 +7602,10 @@
               <w:pStyle w:val="Compact"/>
             </w:pPr>
             <w:r>
-              <w:t xml:space="preserve">Unguarded shell dispatch</w:t>
+              <w:rPr>
+                <w:rStyle w:val="VerbatimChar"/>
+              </w:rPr>
+              <w:t xml:space="preserve">node scripts/verify-audit-artifacts.mjs</w:t>
             </w:r>
           </w:p>
         </w:tc>
@@ -8121,7 +7616,10 @@
               <w:pStyle w:val="Compact"/>
             </w:pPr>
             <w:r>
-              <w:t xml:space="preserve">Direct uninspected child process</w:t>
+              <w:rPr>
+                <w:rStyle w:val="VerbatimChar"/>
+              </w:rPr>
+              <w:t xml:space="preserve">docs/traces/connectivity-trace.json</w:t>
             </w:r>
           </w:p>
         </w:tc>
@@ -8130,13 +7628,14 @@
           <w:p>
             <w:pPr>
               <w:pStyle w:val="Compact"/>
+              <w:jc w:val="center"/>
             </w:pPr>
             <w:r>
               <w:rPr>
                 <w:b/>
                 <w:bCs/>
               </w:rPr>
-              <w:t xml:space="preserve">Three-Tier Policy Engine + PTY Scrubbing</w:t>
+              <w:t xml:space="preserve">VERIFIED (0 Raw Keys Exposed)</w:t>
             </w:r>
           </w:p>
         </w:tc>
@@ -8153,7 +7652,7 @@
                 <w:b/>
                 <w:bCs/>
               </w:rPr>
-              <w:t xml:space="preserve">Multi-Model Routing</w:t>
+              <w:t xml:space="preserve">Open-Path Perf Budgets</w:t>
             </w:r>
           </w:p>
         </w:tc>
@@ -8164,7 +7663,10 @@
               <w:pStyle w:val="Compact"/>
             </w:pPr>
             <w:r>
-              <w:t xml:space="preserve">Single-vendor lock-in</w:t>
+              <w:rPr>
+                <w:rStyle w:val="VerbatimChar"/>
+              </w:rPr>
+              <w:t xml:space="preserve">node scripts/run-live-e2e.mjs</w:t>
             </w:r>
           </w:p>
         </w:tc>
@@ -8175,7 +7677,10 @@
               <w:pStyle w:val="Compact"/>
             </w:pPr>
             <w:r>
-              <w:t xml:space="preserve">Hardcoded API keys</w:t>
+              <w:rPr>
+                <w:rStyle w:val="VerbatimChar"/>
+              </w:rPr>
+              <w:t xml:space="preserve">docs/traces/open-perf-trace.json</w:t>
             </w:r>
           </w:p>
         </w:tc>
@@ -8184,13 +7689,14 @@
           <w:p>
             <w:pPr>
               <w:pStyle w:val="Compact"/>
+              <w:jc w:val="center"/>
             </w:pPr>
             <w:r>
               <w:rPr>
                 <w:b/>
                 <w:bCs/>
               </w:rPr>
-              <w:t xml:space="preserve">Dynamic DAG Failover + 11-Harness Supply</w:t>
+              <w:t xml:space="preserve">VERIFIED (&lt;1500ms 10k Tree Paint)</w:t>
             </w:r>
           </w:p>
         </w:tc>
@@ -8207,7 +7713,7 @@
                 <w:b/>
                 <w:bCs/>
               </w:rPr>
-              <w:t xml:space="preserve">Context Compaction</w:t>
+              <w:t xml:space="preserve">100% FCC Coverage Matrix</w:t>
             </w:r>
           </w:p>
         </w:tc>
@@ -8218,7 +7724,10 @@
               <w:pStyle w:val="Compact"/>
             </w:pPr>
             <w:r>
-              <w:t xml:space="preserve">Truncation / Drop oldest messages</w:t>
+              <w:rPr>
+                <w:rStyle w:val="VerbatimChar"/>
+              </w:rPr>
+              <w:t xml:space="preserve">node scripts/verify-fcc-coverage.mjs</w:t>
             </w:r>
           </w:p>
         </w:tc>
@@ -8229,7 +7738,10 @@
               <w:pStyle w:val="Compact"/>
             </w:pPr>
             <w:r>
-              <w:t xml:space="preserve">Lossy manual clearing</w:t>
+              <w:rPr>
+                <w:rStyle w:val="VerbatimChar"/>
+              </w:rPr>
+              <w:t xml:space="preserve">docs/traces/fcc-coverage.json</w:t>
             </w:r>
           </w:p>
         </w:tc>
@@ -8238,13 +7750,14 @@
           <w:p>
             <w:pPr>
               <w:pStyle w:val="Compact"/>
+              <w:jc w:val="center"/>
             </w:pPr>
             <w:r>
               <w:rPr>
                 <w:b/>
                 <w:bCs/>
               </w:rPr>
-              <w:t xml:space="preserve">Autonomous 95% Saliency Compaction</w:t>
+              <w:t xml:space="preserve">VERIFIED (12/12 Capabilities Pass)</w:t>
             </w:r>
           </w:p>
         </w:tc>
@@ -8261,7 +7774,7 @@
                 <w:b/>
                 <w:bCs/>
               </w:rPr>
-              <w:t xml:space="preserve">Fleet Governance</w:t>
+              <w:t xml:space="preserve">Sandbox &amp; AST Escapes</w:t>
             </w:r>
           </w:p>
         </w:tc>
@@ -8272,7 +7785,10 @@
               <w:pStyle w:val="Compact"/>
             </w:pPr>
             <w:r>
-              <w:t xml:space="preserve">User-level cloud subscription portals</w:t>
+              <w:rPr>
+                <w:rStyle w:val="VerbatimChar"/>
+              </w:rPr>
+              <w:t xml:space="preserve">node scripts/run-extension-security.mjs</w:t>
             </w:r>
           </w:p>
         </w:tc>
@@ -8283,7 +7799,72 @@
               <w:pStyle w:val="Compact"/>
             </w:pPr>
             <w:r>
-              <w:t xml:space="preserve">None</w:t>
+              <w:rPr>
+                <w:rStyle w:val="VerbatimChar"/>
+              </w:rPr>
+              <w:t xml:space="preserve">docs/traces/extension-security.json</w:t>
+            </w:r>
+          </w:p>
+        </w:tc>
+        <w:tc>
+          <w:tcPr/>
+          <w:p>
+            <w:pPr>
+              <w:pStyle w:val="Compact"/>
+              <w:jc w:val="center"/>
+            </w:pPr>
+            <w:r>
+              <w:rPr>
+                <w:b/>
+                <w:bCs/>
+              </w:rPr>
+              <w:t xml:space="preserve">VERIFIED (100% Capability Containment)</w:t>
+            </w:r>
+          </w:p>
+        </w:tc>
+      </w:tr>
+    </w:tbl>
+    <w:p>
+      <w:r>
+        <w:pict>
+          <v:rect style="width:0;height:1.5pt" o:hralign="center" o:hrstd="t" o:hr="t"/>
+        </w:pict>
+      </w:r>
+    </w:p>
+    <w:p>
+      <w:pPr>
+        <w:pStyle w:val="Heading2"/>
+      </w:pPr>
+      <w:bookmarkStart w:id="37" w:name="_9630a1e490ba57c20126b55a457150e94f23957"/>
+      <w:r>
+        <w:t xml:space="preserve">7. Comparative Architectural Matrix</w:t>
+      </w:r>
+      <w:bookmarkEnd w:id="37"/>
+    </w:p>
+    <w:tbl>
+      <w:tblPr>
+        <w:tblStyle w:val="Table"/>
+        <w:tblW w:type="auto" w:w="0"/>
+        <w:tblLook w:firstRow="1" w:lastRow="0" w:firstColumn="0" w:lastColumn="0" w:noHBand="0" w:noVBand="0" w:val="0020"/>
+      </w:tblPr>
+      <w:tblGrid>
+        <w:gridCol w:w="1980"/>
+        <w:gridCol w:w="1980"/>
+        <w:gridCol w:w="1980"/>
+        <w:gridCol w:w="1980"/>
+      </w:tblGrid>
+      <w:tr>
+        <w:trPr>
+          <w:tblHeader w:val="on"/>
+        </w:trPr>
+        <w:tc>
+          <w:tcPr/>
+          <w:p>
+            <w:pPr>
+              <w:pStyle w:val="Compact"/>
+            </w:pPr>
+            <w:r>
+              <w:t xml:space="preserve">Architectural Vector</w:t>
             </w:r>
           </w:p>
         </w:tc>
@@ -8294,11 +7875,29 @@
               <w:pStyle w:val="Compact"/>
             </w:pPr>
             <w:r>
-              <w:rPr>
-                <w:b/>
-                <w:bCs/>
-              </w:rPr>
-              <w:t xml:space="preserve">Centralized MDM (GPO / Intune / Jamf)</w:t>
+              <w:t xml:space="preserve">Cloud-Centric AI IDEs (Copilot, Cursor)</w:t>
+            </w:r>
+          </w:p>
+        </w:tc>
+        <w:tc>
+          <w:tcPr/>
+          <w:p>
+            <w:pPr>
+              <w:pStyle w:val="Compact"/>
+            </w:pPr>
+            <w:r>
+              <w:t xml:space="preserve">Generic Open-Source Wrappers</w:t>
+            </w:r>
+          </w:p>
+        </w:tc>
+        <w:tc>
+          <w:tcPr/>
+          <w:p>
+            <w:pPr>
+              <w:pStyle w:val="Compact"/>
+            </w:pPr>
+            <w:r>
+              <w:t xml:space="preserve">Ty-Code Enterprise</w:t>
             </w:r>
           </w:p>
         </w:tc>
@@ -8315,7 +7914,7 @@
                 <w:b/>
                 <w:bCs/>
               </w:rPr>
-              <w:t xml:space="preserve">Audit Reproducibility</w:t>
+              <w:t xml:space="preserve">Data Residency</w:t>
             </w:r>
           </w:p>
         </w:tc>
@@ -8326,7 +7925,7 @@
               <w:pStyle w:val="Compact"/>
             </w:pPr>
             <w:r>
-              <w:t xml:space="preserve">Proprietary telemetry black box</w:t>
+              <w:t xml:space="preserve">Third-party multitenant cloud servers</w:t>
             </w:r>
           </w:p>
         </w:tc>
@@ -8337,7 +7936,7 @@
               <w:pStyle w:val="Compact"/>
             </w:pPr>
             <w:r>
-              <w:t xml:space="preserve">Unverifiable</w:t>
+              <w:t xml:space="preserve">Variable / unmanaged</w:t>
             </w:r>
           </w:p>
         </w:tc>
@@ -8352,6 +7951,414 @@
                 <w:b/>
                 <w:bCs/>
               </w:rPr>
+              <w:t xml:space="preserve">100% Local-First / Private Gateway</w:t>
+            </w:r>
+          </w:p>
+        </w:tc>
+      </w:tr>
+      <w:tr>
+        <w:tc>
+          <w:tcPr/>
+          <w:p>
+            <w:pPr>
+              <w:pStyle w:val="Compact"/>
+            </w:pPr>
+            <w:r>
+              <w:rPr>
+                <w:b/>
+                <w:bCs/>
+              </w:rPr>
+              <w:t xml:space="preserve">Credential Storage</w:t>
+            </w:r>
+          </w:p>
+        </w:tc>
+        <w:tc>
+          <w:tcPr/>
+          <w:p>
+            <w:pPr>
+              <w:pStyle w:val="Compact"/>
+            </w:pPr>
+            <w:r>
+              <w:t xml:space="preserve">Plaintext config files / token cookies</w:t>
+            </w:r>
+          </w:p>
+        </w:tc>
+        <w:tc>
+          <w:tcPr/>
+          <w:p>
+            <w:pPr>
+              <w:pStyle w:val="Compact"/>
+            </w:pPr>
+            <w:r>
+              <w:t xml:space="preserve">Plaintext</w:t>
+            </w:r>
+            <w:r>
+              <w:t xml:space="preserve"> </w:t>
+            </w:r>
+            <w:r>
+              <w:rPr>
+                <w:rStyle w:val="VerbatimChar"/>
+              </w:rPr>
+              <w:t xml:space="preserve">.env</w:t>
+            </w:r>
+            <w:r>
+              <w:t xml:space="preserve"> </w:t>
+            </w:r>
+            <w:r>
+              <w:t xml:space="preserve">files</w:t>
+            </w:r>
+          </w:p>
+        </w:tc>
+        <w:tc>
+          <w:tcPr/>
+          <w:p>
+            <w:pPr>
+              <w:pStyle w:val="Compact"/>
+            </w:pPr>
+            <w:r>
+              <w:rPr>
+                <w:b/>
+                <w:bCs/>
+              </w:rPr>
+              <w:t xml:space="preserve">OS-Level Hardware Vault (</w:t>
+            </w:r>
+            <w:r>
+              <w:rPr>
+                <w:rStyle w:val="VerbatimChar"/>
+                <w:b/>
+                <w:bCs/>
+              </w:rPr>
+              <w:t xml:space="preserve">safeStorage</w:t>
+            </w:r>
+            <w:r>
+              <w:rPr>
+                <w:b/>
+                <w:bCs/>
+              </w:rPr>
+              <w:t xml:space="preserve">)</w:t>
+            </w:r>
+          </w:p>
+        </w:tc>
+      </w:tr>
+      <w:tr>
+        <w:tc>
+          <w:tcPr/>
+          <w:p>
+            <w:pPr>
+              <w:pStyle w:val="Compact"/>
+            </w:pPr>
+            <w:r>
+              <w:rPr>
+                <w:b/>
+                <w:bCs/>
+              </w:rPr>
+              <w:t xml:space="preserve">Process Isolation</w:t>
+            </w:r>
+          </w:p>
+        </w:tc>
+        <w:tc>
+          <w:tcPr/>
+          <w:p>
+            <w:pPr>
+              <w:pStyle w:val="Compact"/>
+            </w:pPr>
+            <w:r>
+              <w:t xml:space="preserve">Monolithic or standard web views</w:t>
+            </w:r>
+          </w:p>
+        </w:tc>
+        <w:tc>
+          <w:tcPr/>
+          <w:p>
+            <w:pPr>
+              <w:pStyle w:val="Compact"/>
+            </w:pPr>
+            <w:r>
+              <w:t xml:space="preserve">Unchecked Node.js scripts</w:t>
+            </w:r>
+          </w:p>
+        </w:tc>
+        <w:tc>
+          <w:tcPr/>
+          <w:p>
+            <w:pPr>
+              <w:pStyle w:val="Compact"/>
+            </w:pPr>
+            <w:r>
+              <w:rPr>
+                <w:b/>
+                <w:bCs/>
+              </w:rPr>
+              <w:t xml:space="preserve">Chromium Sandbox + contextBridge + Zod</w:t>
+            </w:r>
+          </w:p>
+        </w:tc>
+      </w:tr>
+      <w:tr>
+        <w:tc>
+          <w:tcPr/>
+          <w:p>
+            <w:pPr>
+              <w:pStyle w:val="Compact"/>
+            </w:pPr>
+            <w:r>
+              <w:rPr>
+                <w:b/>
+                <w:bCs/>
+              </w:rPr>
+              <w:t xml:space="preserve">Terminal Execution</w:t>
+            </w:r>
+          </w:p>
+        </w:tc>
+        <w:tc>
+          <w:tcPr/>
+          <w:p>
+            <w:pPr>
+              <w:pStyle w:val="Compact"/>
+            </w:pPr>
+            <w:r>
+              <w:t xml:space="preserve">Unguarded shell dispatch</w:t>
+            </w:r>
+          </w:p>
+        </w:tc>
+        <w:tc>
+          <w:tcPr/>
+          <w:p>
+            <w:pPr>
+              <w:pStyle w:val="Compact"/>
+            </w:pPr>
+            <w:r>
+              <w:t xml:space="preserve">Direct uninspected child process</w:t>
+            </w:r>
+          </w:p>
+        </w:tc>
+        <w:tc>
+          <w:tcPr/>
+          <w:p>
+            <w:pPr>
+              <w:pStyle w:val="Compact"/>
+            </w:pPr>
+            <w:r>
+              <w:rPr>
+                <w:b/>
+                <w:bCs/>
+              </w:rPr>
+              <w:t xml:space="preserve">Three-Tier Policy Engine + PTY Scrubbing</w:t>
+            </w:r>
+          </w:p>
+        </w:tc>
+      </w:tr>
+      <w:tr>
+        <w:tc>
+          <w:tcPr/>
+          <w:p>
+            <w:pPr>
+              <w:pStyle w:val="Compact"/>
+            </w:pPr>
+            <w:r>
+              <w:rPr>
+                <w:b/>
+                <w:bCs/>
+              </w:rPr>
+              <w:t xml:space="preserve">Multi-Model Routing</w:t>
+            </w:r>
+          </w:p>
+        </w:tc>
+        <w:tc>
+          <w:tcPr/>
+          <w:p>
+            <w:pPr>
+              <w:pStyle w:val="Compact"/>
+            </w:pPr>
+            <w:r>
+              <w:t xml:space="preserve">Single-vendor lock-in</w:t>
+            </w:r>
+          </w:p>
+        </w:tc>
+        <w:tc>
+          <w:tcPr/>
+          <w:p>
+            <w:pPr>
+              <w:pStyle w:val="Compact"/>
+            </w:pPr>
+            <w:r>
+              <w:t xml:space="preserve">Hardcoded API keys</w:t>
+            </w:r>
+          </w:p>
+        </w:tc>
+        <w:tc>
+          <w:tcPr/>
+          <w:p>
+            <w:pPr>
+              <w:pStyle w:val="Compact"/>
+            </w:pPr>
+            <w:r>
+              <w:rPr>
+                <w:b/>
+                <w:bCs/>
+              </w:rPr>
+              <w:t xml:space="preserve">Dynamic DAG Failover + 11-Harness Supply</w:t>
+            </w:r>
+          </w:p>
+        </w:tc>
+      </w:tr>
+      <w:tr>
+        <w:tc>
+          <w:tcPr/>
+          <w:p>
+            <w:pPr>
+              <w:pStyle w:val="Compact"/>
+            </w:pPr>
+            <w:r>
+              <w:rPr>
+                <w:b/>
+                <w:bCs/>
+              </w:rPr>
+              <w:t xml:space="preserve">Context Compaction</w:t>
+            </w:r>
+          </w:p>
+        </w:tc>
+        <w:tc>
+          <w:tcPr/>
+          <w:p>
+            <w:pPr>
+              <w:pStyle w:val="Compact"/>
+            </w:pPr>
+            <w:r>
+              <w:t xml:space="preserve">Truncation / Drop oldest messages</w:t>
+            </w:r>
+          </w:p>
+        </w:tc>
+        <w:tc>
+          <w:tcPr/>
+          <w:p>
+            <w:pPr>
+              <w:pStyle w:val="Compact"/>
+            </w:pPr>
+            <w:r>
+              <w:t xml:space="preserve">Lossy manual clearing</w:t>
+            </w:r>
+          </w:p>
+        </w:tc>
+        <w:tc>
+          <w:tcPr/>
+          <w:p>
+            <w:pPr>
+              <w:pStyle w:val="Compact"/>
+            </w:pPr>
+            <w:r>
+              <w:rPr>
+                <w:b/>
+                <w:bCs/>
+              </w:rPr>
+              <w:t xml:space="preserve">Autonomous 95% Saliency Compaction</w:t>
+            </w:r>
+          </w:p>
+        </w:tc>
+      </w:tr>
+      <w:tr>
+        <w:tc>
+          <w:tcPr/>
+          <w:p>
+            <w:pPr>
+              <w:pStyle w:val="Compact"/>
+            </w:pPr>
+            <w:r>
+              <w:rPr>
+                <w:b/>
+                <w:bCs/>
+              </w:rPr>
+              <w:t xml:space="preserve">Fleet Governance</w:t>
+            </w:r>
+          </w:p>
+        </w:tc>
+        <w:tc>
+          <w:tcPr/>
+          <w:p>
+            <w:pPr>
+              <w:pStyle w:val="Compact"/>
+            </w:pPr>
+            <w:r>
+              <w:t xml:space="preserve">User-level cloud subscription portals</w:t>
+            </w:r>
+          </w:p>
+        </w:tc>
+        <w:tc>
+          <w:tcPr/>
+          <w:p>
+            <w:pPr>
+              <w:pStyle w:val="Compact"/>
+            </w:pPr>
+            <w:r>
+              <w:t xml:space="preserve">None</w:t>
+            </w:r>
+          </w:p>
+        </w:tc>
+        <w:tc>
+          <w:tcPr/>
+          <w:p>
+            <w:pPr>
+              <w:pStyle w:val="Compact"/>
+            </w:pPr>
+            <w:r>
+              <w:rPr>
+                <w:b/>
+                <w:bCs/>
+              </w:rPr>
+              <w:t xml:space="preserve">Centralized MDM (GPO / Intune / Jamf)</w:t>
+            </w:r>
+          </w:p>
+        </w:tc>
+      </w:tr>
+      <w:tr>
+        <w:tc>
+          <w:tcPr/>
+          <w:p>
+            <w:pPr>
+              <w:pStyle w:val="Compact"/>
+            </w:pPr>
+            <w:r>
+              <w:rPr>
+                <w:b/>
+                <w:bCs/>
+              </w:rPr>
+              <w:t xml:space="preserve">Audit Reproducibility</w:t>
+            </w:r>
+          </w:p>
+        </w:tc>
+        <w:tc>
+          <w:tcPr/>
+          <w:p>
+            <w:pPr>
+              <w:pStyle w:val="Compact"/>
+            </w:pPr>
+            <w:r>
+              <w:t xml:space="preserve">Proprietary telemetry black box</w:t>
+            </w:r>
+          </w:p>
+        </w:tc>
+        <w:tc>
+          <w:tcPr/>
+          <w:p>
+            <w:pPr>
+              <w:pStyle w:val="Compact"/>
+            </w:pPr>
+            <w:r>
+              <w:t xml:space="preserve">Unverifiable</w:t>
+            </w:r>
+          </w:p>
+        </w:tc>
+        <w:tc>
+          <w:tcPr/>
+          <w:p>
+            <w:pPr>
+              <w:pStyle w:val="Compact"/>
+            </w:pPr>
+            <w:r>
+              <w:rPr>
+                <w:b/>
+                <w:bCs/>
+              </w:rPr>
               <w:t xml:space="preserve">Machine-Readable Traces (</w:t>
             </w:r>
             <w:r>
@@ -8384,7 +8391,7 @@
       <w:pPr>
         <w:pStyle w:val="Heading2"/>
       </w:pPr>
-      <w:bookmarkStart w:id="38" w:name="_9b1fbad3c6bdbdc26f5c8edd1c8b961083e70d2"/>
+      <w:bookmarkStart w:id="38" w:name="_19ba53e35ea8e6f4dae59e39c94793c244a72c5"/>
       <w:r>
         <w:t xml:space="preserve">8. Conclusion: Strategic Recommendation for Procurement</w:t>
       </w:r>
@@ -8461,14 +8468,16 @@
         <w:t xml:space="preserve"> </w:t>
       </w:r>
       <w:hyperlink r:id="rId39">
-        <w:r>
-          <w:rPr>
-            <w:rStyle w:val="Hyperlink"/>
-            <w:i/>
-            <w:iCs/>
-          </w:rPr>
-          <w:t xml:space="preserve">https://tycode.io</w:t>
-        </w:r>
+        <w:hyperlink r:id="rId39">
+          <w:r>
+            <w:rPr>
+              <w:rStyle w:val="Hyperlink"/>
+              <w:i/>
+              <w:iCs/>
+            </w:rPr>
+            <w:t xml:space="preserve">https://tycode.io</w:t>
+          </w:r>
+        </w:hyperlink>
       </w:hyperlink>
       <w:r>
         <w:rPr>
@@ -8811,6 +8820,171 @@
   </w:num>
   <w:num w:numId="1002">
     <w:abstractNumId w:val="991"/>
+  </w:num>
+  <w:num w:numId="1003">
+    <w:abstractNumId w:val="991"/>
+  </w:num>
+  <w:num w:numId="1004">
+    <w:abstractNumId w:val="99411"/>
+    <w:lvlOverride w:ilvl="0">
+      <w:startOverride w:val="1"/>
+    </w:lvlOverride>
+    <w:lvlOverride w:ilvl="1">
+      <w:startOverride w:val="1"/>
+    </w:lvlOverride>
+    <w:lvlOverride w:ilvl="2">
+      <w:startOverride w:val="1"/>
+    </w:lvlOverride>
+    <w:lvlOverride w:ilvl="3">
+      <w:startOverride w:val="1"/>
+    </w:lvlOverride>
+    <w:lvlOverride w:ilvl="4">
+      <w:startOverride w:val="1"/>
+    </w:lvlOverride>
+    <w:lvlOverride w:ilvl="5">
+      <w:startOverride w:val="1"/>
+    </w:lvlOverride>
+    <w:lvlOverride w:ilvl="6">
+      <w:startOverride w:val="1"/>
+    </w:lvlOverride>
+    <w:lvlOverride w:ilvl="7">
+      <w:startOverride w:val="1"/>
+    </w:lvlOverride>
+    <w:lvlOverride w:ilvl="8">
+      <w:startOverride w:val="1"/>
+    </w:lvlOverride>
+  </w:num>
+  <w:num w:numId="1005">
+    <w:abstractNumId w:val="99411"/>
+    <w:lvlOverride w:ilvl="0">
+      <w:startOverride w:val="1"/>
+    </w:lvlOverride>
+    <w:lvlOverride w:ilvl="1">
+      <w:startOverride w:val="1"/>
+    </w:lvlOverride>
+    <w:lvlOverride w:ilvl="2">
+      <w:startOverride w:val="1"/>
+    </w:lvlOverride>
+    <w:lvlOverride w:ilvl="3">
+      <w:startOverride w:val="1"/>
+    </w:lvlOverride>
+    <w:lvlOverride w:ilvl="4">
+      <w:startOverride w:val="1"/>
+    </w:lvlOverride>
+    <w:lvlOverride w:ilvl="5">
+      <w:startOverride w:val="1"/>
+    </w:lvlOverride>
+    <w:lvlOverride w:ilvl="6">
+      <w:startOverride w:val="1"/>
+    </w:lvlOverride>
+    <w:lvlOverride w:ilvl="7">
+      <w:startOverride w:val="1"/>
+    </w:lvlOverride>
+    <w:lvlOverride w:ilvl="8">
+      <w:startOverride w:val="1"/>
+    </w:lvlOverride>
+  </w:num>
+  <w:num w:numId="1006">
+    <w:abstractNumId w:val="99411"/>
+    <w:lvlOverride w:ilvl="0">
+      <w:startOverride w:val="1"/>
+    </w:lvlOverride>
+    <w:lvlOverride w:ilvl="1">
+      <w:startOverride w:val="1"/>
+    </w:lvlOverride>
+    <w:lvlOverride w:ilvl="2">
+      <w:startOverride w:val="1"/>
+    </w:lvlOverride>
+    <w:lvlOverride w:ilvl="3">
+      <w:startOverride w:val="1"/>
+    </w:lvlOverride>
+    <w:lvlOverride w:ilvl="4">
+      <w:startOverride w:val="1"/>
+    </w:lvlOverride>
+    <w:lvlOverride w:ilvl="5">
+      <w:startOverride w:val="1"/>
+    </w:lvlOverride>
+    <w:lvlOverride w:ilvl="6">
+      <w:startOverride w:val="1"/>
+    </w:lvlOverride>
+    <w:lvlOverride w:ilvl="7">
+      <w:startOverride w:val="1"/>
+    </w:lvlOverride>
+    <w:lvlOverride w:ilvl="8">
+      <w:startOverride w:val="1"/>
+    </w:lvlOverride>
+  </w:num>
+  <w:num w:numId="1007">
+    <w:abstractNumId w:val="991"/>
+  </w:num>
+  <w:num w:numId="1008">
+    <w:abstractNumId w:val="991"/>
+  </w:num>
+  <w:num w:numId="1009">
+    <w:abstractNumId w:val="99411"/>
+    <w:lvlOverride w:ilvl="0">
+      <w:startOverride w:val="1"/>
+    </w:lvlOverride>
+    <w:lvlOverride w:ilvl="1">
+      <w:startOverride w:val="1"/>
+    </w:lvlOverride>
+    <w:lvlOverride w:ilvl="2">
+      <w:startOverride w:val="1"/>
+    </w:lvlOverride>
+    <w:lvlOverride w:ilvl="3">
+      <w:startOverride w:val="1"/>
+    </w:lvlOverride>
+    <w:lvlOverride w:ilvl="4">
+      <w:startOverride w:val="1"/>
+    </w:lvlOverride>
+    <w:lvlOverride w:ilvl="5">
+      <w:startOverride w:val="1"/>
+    </w:lvlOverride>
+    <w:lvlOverride w:ilvl="6">
+      <w:startOverride w:val="1"/>
+    </w:lvlOverride>
+    <w:lvlOverride w:ilvl="7">
+      <w:startOverride w:val="1"/>
+    </w:lvlOverride>
+    <w:lvlOverride w:ilvl="8">
+      <w:startOverride w:val="1"/>
+    </w:lvlOverride>
+  </w:num>
+  <w:num w:numId="1010">
+    <w:abstractNumId w:val="991"/>
+  </w:num>
+  <w:num w:numId="1011">
+    <w:abstractNumId w:val="991"/>
+  </w:num>
+  <w:num w:numId="1012">
+    <w:abstractNumId w:val="99411"/>
+    <w:lvlOverride w:ilvl="0">
+      <w:startOverride w:val="1"/>
+    </w:lvlOverride>
+    <w:lvlOverride w:ilvl="1">
+      <w:startOverride w:val="1"/>
+    </w:lvlOverride>
+    <w:lvlOverride w:ilvl="2">
+      <w:startOverride w:val="1"/>
+    </w:lvlOverride>
+    <w:lvlOverride w:ilvl="3">
+      <w:startOverride w:val="1"/>
+    </w:lvlOverride>
+    <w:lvlOverride w:ilvl="4">
+      <w:startOverride w:val="1"/>
+    </w:lvlOverride>
+    <w:lvlOverride w:ilvl="5">
+      <w:startOverride w:val="1"/>
+    </w:lvlOverride>
+    <w:lvlOverride w:ilvl="6">
+      <w:startOverride w:val="1"/>
+    </w:lvlOverride>
+    <w:lvlOverride w:ilvl="7">
+      <w:startOverride w:val="1"/>
+    </w:lvlOverride>
+    <w:lvlOverride w:ilvl="8">
+      <w:startOverride w:val="1"/>
+    </w:lvlOverride>
   </w:num>
 </w:numbering>
 </file>

</xml_diff>